<commit_message>
Render the dissertation chapter from the manuscript; PLOS compliance fixes
paper/build_chapter.py writes the APA 7 Word version of the paper into dissertation-papers/chapter-2
(title page with author note, abstract and keywords, author-date citations, Figure/Table blocks, S1 as
the Appendix), reusing the chapter's build_v5.py styling. The Word working copy of the PLOS manuscript
keeps the equation numbers. Funding moved out of the manuscript's Acknowledgments, the data availability
statement names the repository, and the S1 subtitle carries the new title.
</commit_message>
<xml_diff>
--- a/paper/manuscript.docx
+++ b/paper/manuscript.docx
@@ -1191,6 +1191,24 @@
               <m:sty m:val="p"/>
             </m:rPr>
             <m:t>,</m:t>
+          </m:r>
+          <m:r>
+            <m:t>  </m:t>
+          </m:r>
+          <m:r>
+            <m:rPr>
+              <m:sty m:val="p"/>
+            </m:rPr>
+            <m:t>(</m:t>
+          </m:r>
+          <m:r>
+            <m:t>1</m:t>
+          </m:r>
+          <m:r>
+            <m:rPr>
+              <m:sty m:val="p"/>
+            </m:rPr>
+            <m:t>)</m:t>
           </m:r>
         </m:oMath>
       </m:oMathPara>
@@ -1542,6 +1560,24 @@
             </m:rPr>
             <m:t>,</m:t>
           </m:r>
+          <m:r>
+            <m:t>  </m:t>
+          </m:r>
+          <m:r>
+            <m:rPr>
+              <m:sty m:val="p"/>
+            </m:rPr>
+            <m:t>(</m:t>
+          </m:r>
+          <m:r>
+            <m:t>2</m:t>
+          </m:r>
+          <m:r>
+            <m:rPr>
+              <m:sty m:val="p"/>
+            </m:rPr>
+            <m:t>)</m:t>
+          </m:r>
         </m:oMath>
       </m:oMathPara>
     </w:p>
@@ -1890,6 +1926,24 @@
             </m:rPr>
             <m:t>.</m:t>
           </m:r>
+          <m:r>
+            <m:t>  </m:t>
+          </m:r>
+          <m:r>
+            <m:rPr>
+              <m:sty m:val="p"/>
+            </m:rPr>
+            <m:t>(</m:t>
+          </m:r>
+          <m:r>
+            <m:t>3</m:t>
+          </m:r>
+          <m:r>
+            <m:rPr>
+              <m:sty m:val="p"/>
+            </m:rPr>
+            <m:t>)</m:t>
+          </m:r>
         </m:oMath>
       </m:oMathPara>
     </w:p>
@@ -2162,6 +2216,24 @@
             </m:rPr>
             <m:t>,</m:t>
           </m:r>
+          <m:r>
+            <m:t>  </m:t>
+          </m:r>
+          <m:r>
+            <m:rPr>
+              <m:sty m:val="p"/>
+            </m:rPr>
+            <m:t>(</m:t>
+          </m:r>
+          <m:r>
+            <m:t>4</m:t>
+          </m:r>
+          <m:r>
+            <m:rPr>
+              <m:sty m:val="p"/>
+            </m:rPr>
+            <m:t>)</m:t>
+          </m:r>
         </m:oMath>
       </m:oMathPara>
     </w:p>
@@ -2406,6 +2478,24 @@
               <m:sty m:val="p"/>
             </m:rPr>
             <m:t>.</m:t>
+          </m:r>
+          <m:r>
+            <m:t>  </m:t>
+          </m:r>
+          <m:r>
+            <m:rPr>
+              <m:sty m:val="p"/>
+            </m:rPr>
+            <m:t>(</m:t>
+          </m:r>
+          <m:r>
+            <m:t>5</m:t>
+          </m:r>
+          <m:r>
+            <m:rPr>
+              <m:sty m:val="p"/>
+            </m:rPr>
+            <m:t>)</m:t>
           </m:r>
         </m:oMath>
       </m:oMathPara>
@@ -3248,6 +3338,24 @@
               <m:sty m:val="p"/>
             </m:rPr>
             <m:t>,</m:t>
+          </m:r>
+          <m:r>
+            <m:t>  </m:t>
+          </m:r>
+          <m:r>
+            <m:rPr>
+              <m:sty m:val="p"/>
+            </m:rPr>
+            <m:t>(</m:t>
+          </m:r>
+          <m:r>
+            <m:t>6</m:t>
+          </m:r>
+          <m:r>
+            <m:rPr>
+              <m:sty m:val="p"/>
+            </m:rPr>
+            <m:t>)</m:t>
           </m:r>
         </m:oMath>
       </m:oMathPara>
@@ -3659,6 +3767,24 @@
             </m:rPr>
             <m:t>.</m:t>
           </m:r>
+          <m:r>
+            <m:t>  </m:t>
+          </m:r>
+          <m:r>
+            <m:rPr>
+              <m:sty m:val="p"/>
+            </m:rPr>
+            <m:t>(</m:t>
+          </m:r>
+          <m:r>
+            <m:t>7</m:t>
+          </m:r>
+          <m:r>
+            <m:rPr>
+              <m:sty m:val="p"/>
+            </m:rPr>
+            <m:t>)</m:t>
+          </m:r>
         </m:oMath>
       </m:oMathPara>
     </w:p>
@@ -4269,6 +4395,24 @@
               <m:sty m:val="p"/>
             </m:rPr>
             <m:t>.</m:t>
+          </m:r>
+          <m:r>
+            <m:t>  </m:t>
+          </m:r>
+          <m:r>
+            <m:rPr>
+              <m:sty m:val="p"/>
+            </m:rPr>
+            <m:t>(</m:t>
+          </m:r>
+          <m:r>
+            <m:t>8</m:t>
+          </m:r>
+          <m:r>
+            <m:rPr>
+              <m:sty m:val="p"/>
+            </m:rPr>
+            <m:t>)</m:t>
           </m:r>
         </m:oMath>
       </m:oMathPara>
@@ -5193,6 +5337,24 @@
               <m:sty m:val="p"/>
             </m:rPr>
             <m:t>.</m:t>
+          </m:r>
+          <m:r>
+            <m:t>  </m:t>
+          </m:r>
+          <m:r>
+            <m:rPr>
+              <m:sty m:val="p"/>
+            </m:rPr>
+            <m:t>(</m:t>
+          </m:r>
+          <m:r>
+            <m:t>9</m:t>
+          </m:r>
+          <m:r>
+            <m:rPr>
+              <m:sty m:val="p"/>
+            </m:rPr>
+            <m:t>)</m:t>
           </m:r>
         </m:oMath>
       </m:oMathPara>
@@ -5875,6 +6037,24 @@
               </m:m>
             </m:e>
           </m:d>
+          <m:r>
+            <m:t>  </m:t>
+          </m:r>
+          <m:r>
+            <m:rPr>
+              <m:sty m:val="p"/>
+            </m:rPr>
+            <m:t>(</m:t>
+          </m:r>
+          <m:r>
+            <m:t>10</m:t>
+          </m:r>
+          <m:r>
+            <m:rPr>
+              <m:sty m:val="p"/>
+            </m:rPr>
+            <m:t>)</m:t>
+          </m:r>
         </m:oMath>
       </m:oMathPara>
     </w:p>
@@ -13330,6 +13510,24 @@
             </m:rPr>
             <m:t>,</m:t>
           </m:r>
+          <m:r>
+            <m:t>  </m:t>
+          </m:r>
+          <m:r>
+            <m:rPr>
+              <m:sty m:val="p"/>
+            </m:rPr>
+            <m:t>(</m:t>
+          </m:r>
+          <m:r>
+            <m:t>11</m:t>
+          </m:r>
+          <m:r>
+            <m:rPr>
+              <m:sty m:val="p"/>
+            </m:rPr>
+            <m:t>)</m:t>
+          </m:r>
         </m:oMath>
       </m:oMathPara>
     </w:p>
@@ -14038,6 +14236,24 @@
             </m:rPr>
             <m:t>,</m:t>
           </m:r>
+          <m:r>
+            <m:t>  </m:t>
+          </m:r>
+          <m:r>
+            <m:rPr>
+              <m:sty m:val="p"/>
+            </m:rPr>
+            <m:t>(</m:t>
+          </m:r>
+          <m:r>
+            <m:t>12</m:t>
+          </m:r>
+          <m:r>
+            <m:rPr>
+              <m:sty m:val="p"/>
+            </m:rPr>
+            <m:t>)</m:t>
+          </m:r>
         </m:oMath>
       </m:oMathPara>
     </w:p>
@@ -14457,7 +14673,7 @@
         <w:pStyle w:val="FirstParagraph"/>
       </w:pPr>
       <w:r>
-        <w:t xml:space="preserve">The data, the model and analysis code, and the scripts that reproduce every figure will be deposited in a public repository with a DOI before publication.</w:t>
+        <w:t xml:space="preserve">The data, the model and analysis code, and the scripts that reproduce every figure are available at https://github.com/kiante-fernandez/optimal-attention; a release of the repository will be archived with a DOI before publication.</w:t>
       </w:r>
     </w:p>
     <w:bookmarkEnd w:id="63"/>
@@ -14538,35 +14754,17 @@
       </w:r>
     </w:p>
     <w:bookmarkEnd w:id="65"/>
-    <w:bookmarkStart w:id="66" w:name="acknowledgments"/>
+    <w:bookmarkStart w:id="194" w:name="references"/>
     <w:p>
       <w:pPr>
         <w:pStyle w:val="Heading1"/>
       </w:pPr>
       <w:r>
-        <w:t xml:space="preserve">Acknowledgments</w:t>
+        <w:t xml:space="preserve">References</w:t>
       </w:r>
     </w:p>
-    <w:p>
-      <w:pPr>
-        <w:pStyle w:val="FirstParagraph"/>
-      </w:pPr>
-      <w:r>
-        <w:t xml:space="preserve">Supported by the National Science Foundation (CAREER Award 2148982 to I. K.) and the Ohio State University Decision Sciences Collaborative (K. A. F.).</w:t>
-      </w:r>
-    </w:p>
-    <w:bookmarkEnd w:id="66"/>
-    <w:bookmarkStart w:id="195" w:name="references"/>
-    <w:p>
-      <w:pPr>
-        <w:pStyle w:val="Heading1"/>
-      </w:pPr>
-      <w:r>
-        <w:t xml:space="preserve">References</w:t>
-      </w:r>
-    </w:p>
-    <w:bookmarkStart w:id="194" w:name="refs"/>
-    <w:bookmarkStart w:id="68" w:name="ref-ratcliff2008"/>
+    <w:bookmarkStart w:id="193" w:name="refs"/>
+    <w:bookmarkStart w:id="67" w:name="ref-ratcliff2008"/>
     <w:p>
       <w:pPr>
         <w:pStyle w:val="Bibliography"/>
@@ -14583,7 +14781,7 @@
       <w:r>
         <w:t xml:space="preserve">Ratcliff R, McKoon G. The diffusion decision model: Theory and data for two-choice decision tasks. Neural Computation. 2008;20(4):873–922. doi:</w:t>
       </w:r>
-      <w:hyperlink r:id="rId67">
+      <w:hyperlink r:id="rId66">
         <w:r>
           <w:rPr>
             <w:rStyle w:val="Hyperlink"/>
@@ -14592,8 +14790,8 @@
         </w:r>
       </w:hyperlink>
     </w:p>
-    <w:bookmarkEnd w:id="68"/>
-    <w:bookmarkStart w:id="70" w:name="ref-usher2001"/>
+    <w:bookmarkEnd w:id="67"/>
+    <w:bookmarkStart w:id="69" w:name="ref-usher2001"/>
     <w:p>
       <w:pPr>
         <w:pStyle w:val="Bibliography"/>
@@ -14610,7 +14808,7 @@
       <w:r>
         <w:t xml:space="preserve">Usher M, McClelland JL. The time course of perceptual choice: The leaky, competing accumulator model. Psychological Review. 2001;108(3):550–92. doi:</w:t>
       </w:r>
-      <w:hyperlink r:id="rId69">
+      <w:hyperlink r:id="rId68">
         <w:r>
           <w:rPr>
             <w:rStyle w:val="Hyperlink"/>
@@ -14619,8 +14817,8 @@
         </w:r>
       </w:hyperlink>
     </w:p>
-    <w:bookmarkEnd w:id="70"/>
-    <w:bookmarkStart w:id="72" w:name="ref-milosavljevic2010"/>
+    <w:bookmarkEnd w:id="69"/>
+    <w:bookmarkStart w:id="71" w:name="ref-milosavljevic2010"/>
     <w:p>
       <w:pPr>
         <w:pStyle w:val="Bibliography"/>
@@ -14637,7 +14835,7 @@
       <w:r>
         <w:t xml:space="preserve">Milosavljevic M, Malmaud J, Huth A, Koch C, Rangel A. The drift diffusion model can account for the accuracy and reaction time of value-based choices under high and low time pressure. Judgment and Decision Making. 2010;5(6):437–49. doi:</w:t>
       </w:r>
-      <w:hyperlink r:id="rId71">
+      <w:hyperlink r:id="rId70">
         <w:r>
           <w:rPr>
             <w:rStyle w:val="Hyperlink"/>
@@ -14646,8 +14844,8 @@
         </w:r>
       </w:hyperlink>
     </w:p>
-    <w:bookmarkEnd w:id="72"/>
-    <w:bookmarkStart w:id="74" w:name="ref-busemeyer1993"/>
+    <w:bookmarkEnd w:id="71"/>
+    <w:bookmarkStart w:id="73" w:name="ref-busemeyer1993"/>
     <w:p>
       <w:pPr>
         <w:pStyle w:val="Bibliography"/>
@@ -14664,7 +14862,7 @@
       <w:r>
         <w:t xml:space="preserve">Busemeyer JR, Townsend JT. Decision field theory: A dynamic-cognitive approach to decision making in an uncertain environment. Psychological Review. 1993;100(3):432–59. doi:</w:t>
       </w:r>
-      <w:hyperlink r:id="rId73">
+      <w:hyperlink r:id="rId72">
         <w:r>
           <w:rPr>
             <w:rStyle w:val="Hyperlink"/>
@@ -14673,8 +14871,8 @@
         </w:r>
       </w:hyperlink>
     </w:p>
-    <w:bookmarkEnd w:id="74"/>
-    <w:bookmarkStart w:id="76" w:name="ref-shimojo2003"/>
+    <w:bookmarkEnd w:id="73"/>
+    <w:bookmarkStart w:id="75" w:name="ref-shimojo2003"/>
     <w:p>
       <w:pPr>
         <w:pStyle w:val="Bibliography"/>
@@ -14691,7 +14889,7 @@
       <w:r>
         <w:t xml:space="preserve">Shimojo S, Simion C, Shimojo E, Scheier C. Gaze bias both reflects and influences preference. Nature Neuroscience. 2003;6(12):1317–22. doi:</w:t>
       </w:r>
-      <w:hyperlink r:id="rId75">
+      <w:hyperlink r:id="rId74">
         <w:r>
           <w:rPr>
             <w:rStyle w:val="Hyperlink"/>
@@ -14700,8 +14898,8 @@
         </w:r>
       </w:hyperlink>
     </w:p>
-    <w:bookmarkEnd w:id="76"/>
-    <w:bookmarkStart w:id="78" w:name="ref-krajbich2010"/>
+    <w:bookmarkEnd w:id="75"/>
+    <w:bookmarkStart w:id="77" w:name="ref-krajbich2010"/>
     <w:p>
       <w:pPr>
         <w:pStyle w:val="Bibliography"/>
@@ -14718,7 +14916,7 @@
       <w:r>
         <w:t xml:space="preserve">Krajbich I, Armel C, Rangel A. Visual fixations and the computation and comparison of value in simple choice. Nature Neuroscience. 2010;13(10):1292–8. doi:</w:t>
       </w:r>
-      <w:hyperlink r:id="rId77">
+      <w:hyperlink r:id="rId76">
         <w:r>
           <w:rPr>
             <w:rStyle w:val="Hyperlink"/>
@@ -14727,8 +14925,8 @@
         </w:r>
       </w:hyperlink>
     </w:p>
-    <w:bookmarkEnd w:id="78"/>
-    <w:bookmarkStart w:id="80" w:name="ref-krajbich2011"/>
+    <w:bookmarkEnd w:id="77"/>
+    <w:bookmarkStart w:id="79" w:name="ref-krajbich2011"/>
     <w:p>
       <w:pPr>
         <w:pStyle w:val="Bibliography"/>
@@ -14745,7 +14943,7 @@
       <w:r>
         <w:t xml:space="preserve">Krajbich I, Rangel A. Multialternative drift-diffusion model predicts the relationship between visual fixations and choice in value-based decisions. Proceedings of the National Academy of Sciences. 2011;108(33):13852–7. doi:</w:t>
       </w:r>
-      <w:hyperlink r:id="rId79">
+      <w:hyperlink r:id="rId78">
         <w:r>
           <w:rPr>
             <w:rStyle w:val="Hyperlink"/>
@@ -14754,8 +14952,8 @@
         </w:r>
       </w:hyperlink>
     </w:p>
-    <w:bookmarkEnd w:id="80"/>
-    <w:bookmarkStart w:id="82" w:name="ref-armel2008"/>
+    <w:bookmarkEnd w:id="79"/>
+    <w:bookmarkStart w:id="81" w:name="ref-armel2008"/>
     <w:p>
       <w:pPr>
         <w:pStyle w:val="Bibliography"/>
@@ -14772,7 +14970,7 @@
       <w:r>
         <w:t xml:space="preserve">Armel KC, Beaumel A, Rangel A. Biasing simple choices by manipulating relative visual attention. Judgment and Decision Making. 2008;3(5):396–403. doi:</w:t>
       </w:r>
-      <w:hyperlink r:id="rId81">
+      <w:hyperlink r:id="rId80">
         <w:r>
           <w:rPr>
             <w:rStyle w:val="Hyperlink"/>
@@ -14781,8 +14979,8 @@
         </w:r>
       </w:hyperlink>
     </w:p>
-    <w:bookmarkEnd w:id="82"/>
-    <w:bookmarkStart w:id="84" w:name="ref-smith2019"/>
+    <w:bookmarkEnd w:id="81"/>
+    <w:bookmarkStart w:id="83" w:name="ref-smith2019"/>
     <w:p>
       <w:pPr>
         <w:pStyle w:val="Bibliography"/>
@@ -14799,7 +14997,7 @@
       <w:r>
         <w:t xml:space="preserve">Smith SM, Krajbich I. Gaze amplifies value in decision making. Psychological Science. 2019;30(1):116–28. doi:</w:t>
       </w:r>
-      <w:hyperlink r:id="rId83">
+      <w:hyperlink r:id="rId82">
         <w:r>
           <w:rPr>
             <w:rStyle w:val="Hyperlink"/>
@@ -14808,8 +15006,8 @@
         </w:r>
       </w:hyperlink>
     </w:p>
-    <w:bookmarkEnd w:id="84"/>
-    <w:bookmarkStart w:id="86" w:name="ref-bhatnagar2022"/>
+    <w:bookmarkEnd w:id="83"/>
+    <w:bookmarkStart w:id="85" w:name="ref-bhatnagar2022"/>
     <w:p>
       <w:pPr>
         <w:pStyle w:val="Bibliography"/>
@@ -14826,7 +15024,7 @@
       <w:r>
         <w:t xml:space="preserve">Bhatnagar R, Orquin JL. A meta-analysis on the effect of visual attention on choice. Journal of Experimental Psychology: General. 2022;151(10):2265–83. doi:</w:t>
       </w:r>
-      <w:hyperlink r:id="rId85">
+      <w:hyperlink r:id="rId84">
         <w:r>
           <w:rPr>
             <w:rStyle w:val="Hyperlink"/>
@@ -14835,8 +15033,8 @@
         </w:r>
       </w:hyperlink>
     </w:p>
-    <w:bookmarkEnd w:id="86"/>
-    <w:bookmarkStart w:id="88" w:name="ref-thomas2019"/>
+    <w:bookmarkEnd w:id="85"/>
+    <w:bookmarkStart w:id="87" w:name="ref-thomas2019"/>
     <w:p>
       <w:pPr>
         <w:pStyle w:val="Bibliography"/>
@@ -14853,7 +15051,7 @@
       <w:r>
         <w:t xml:space="preserve">Thomas AW, Molter F, Krajbich I, Heekeren HR, Mohr PNC. Gaze bias differences capture individual choice behaviour. Nature Human Behaviour. 2019;3(6):625–35. doi:</w:t>
       </w:r>
-      <w:hyperlink r:id="rId87">
+      <w:hyperlink r:id="rId86">
         <w:r>
           <w:rPr>
             <w:rStyle w:val="Hyperlink"/>
@@ -14862,8 +15060,8 @@
         </w:r>
       </w:hyperlink>
     </w:p>
-    <w:bookmarkEnd w:id="88"/>
-    <w:bookmarkStart w:id="90" w:name="ref-krajbich2019"/>
+    <w:bookmarkEnd w:id="87"/>
+    <w:bookmarkStart w:id="89" w:name="ref-krajbich2019"/>
     <w:p>
       <w:pPr>
         <w:pStyle w:val="Bibliography"/>
@@ -14880,7 +15078,7 @@
       <w:r>
         <w:t xml:space="preserve">Krajbich I. Accounting for attention in sequential sampling models of decision making. Current Opinion in Psychology. 2019;29:6–11. doi:</w:t>
       </w:r>
-      <w:hyperlink r:id="rId89">
+      <w:hyperlink r:id="rId88">
         <w:r>
           <w:rPr>
             <w:rStyle w:val="Hyperlink"/>
@@ -14889,8 +15087,8 @@
         </w:r>
       </w:hyperlink>
     </w:p>
-    <w:bookmarkEnd w:id="90"/>
-    <w:bookmarkStart w:id="92" w:name="ref-ting2024"/>
+    <w:bookmarkEnd w:id="89"/>
+    <w:bookmarkStart w:id="91" w:name="ref-ting2024"/>
     <w:p>
       <w:pPr>
         <w:pStyle w:val="Bibliography"/>
@@ -14907,7 +15105,7 @@
       <w:r>
         <w:t xml:space="preserve">Ting CC, Gluth S. Unraveling information processes of decision-making with eye-tracking data. Frontiers in Behavioral Economics. 2024;3:1384713. doi:</w:t>
       </w:r>
-      <w:hyperlink r:id="rId91">
+      <w:hyperlink r:id="rId90">
         <w:r>
           <w:rPr>
             <w:rStyle w:val="Hyperlink"/>
@@ -14916,8 +15114,8 @@
         </w:r>
       </w:hyperlink>
     </w:p>
-    <w:bookmarkEnd w:id="92"/>
-    <w:bookmarkStart w:id="94" w:name="ref-callaway2021"/>
+    <w:bookmarkEnd w:id="91"/>
+    <w:bookmarkStart w:id="93" w:name="ref-callaway2021"/>
     <w:p>
       <w:pPr>
         <w:pStyle w:val="Bibliography"/>
@@ -14934,7 +15132,7 @@
       <w:r>
         <w:t xml:space="preserve">Callaway F, Rangel A, Griffiths TL. Fixation patterns in simple choice reflect optimal information sampling. PLOS Computational Biology. 2021;17(3):e1008863. doi:</w:t>
       </w:r>
-      <w:hyperlink r:id="rId93">
+      <w:hyperlink r:id="rId92">
         <w:r>
           <w:rPr>
             <w:rStyle w:val="Hyperlink"/>
@@ -14943,8 +15141,8 @@
         </w:r>
       </w:hyperlink>
     </w:p>
-    <w:bookmarkEnd w:id="94"/>
-    <w:bookmarkStart w:id="96" w:name="ref-jang2021"/>
+    <w:bookmarkEnd w:id="93"/>
+    <w:bookmarkStart w:id="95" w:name="ref-jang2021"/>
     <w:p>
       <w:pPr>
         <w:pStyle w:val="Bibliography"/>
@@ -14961,7 +15159,7 @@
       <w:r>
         <w:t xml:space="preserve">Jang AI, Sharma R, Drugowitsch J. Optimal policy for attention-modulated decisions explains human fixation behavior. eLife. 2021;10:e63436. doi:</w:t>
       </w:r>
-      <w:hyperlink r:id="rId95">
+      <w:hyperlink r:id="rId94">
         <w:r>
           <w:rPr>
             <w:rStyle w:val="Hyperlink"/>
@@ -14970,8 +15168,8 @@
         </w:r>
       </w:hyperlink>
     </w:p>
-    <w:bookmarkEnd w:id="96"/>
-    <w:bookmarkStart w:id="98" w:name="ref-tajima2016"/>
+    <w:bookmarkEnd w:id="95"/>
+    <w:bookmarkStart w:id="97" w:name="ref-tajima2016"/>
     <w:p>
       <w:pPr>
         <w:pStyle w:val="Bibliography"/>
@@ -14988,7 +15186,7 @@
       <w:r>
         <w:t xml:space="preserve">Tajima S, Drugowitsch J, Pouget A. Optimal policy for value-based decision-making. Nature Communications. 2016;7:12400. doi:</w:t>
       </w:r>
-      <w:hyperlink r:id="rId97">
+      <w:hyperlink r:id="rId96">
         <w:r>
           <w:rPr>
             <w:rStyle w:val="Hyperlink"/>
@@ -14997,8 +15195,8 @@
         </w:r>
       </w:hyperlink>
     </w:p>
-    <w:bookmarkEnd w:id="98"/>
-    <w:bookmarkStart w:id="100" w:name="ref-tajima2019"/>
+    <w:bookmarkEnd w:id="97"/>
+    <w:bookmarkStart w:id="99" w:name="ref-tajima2019"/>
     <w:p>
       <w:pPr>
         <w:pStyle w:val="Bibliography"/>
@@ -15015,7 +15213,7 @@
       <w:r>
         <w:t xml:space="preserve">Tajima S, Drugowitsch J, Patel N, Pouget A. Optimal policy for multi-alternative decisions. Nature Neuroscience. 2019;22(9):1503–11. doi:</w:t>
       </w:r>
-      <w:hyperlink r:id="rId99">
+      <w:hyperlink r:id="rId98">
         <w:r>
           <w:rPr>
             <w:rStyle w:val="Hyperlink"/>
@@ -15024,8 +15222,8 @@
         </w:r>
       </w:hyperlink>
     </w:p>
-    <w:bookmarkEnd w:id="100"/>
-    <w:bookmarkStart w:id="102" w:name="ref-fudenberg2018"/>
+    <w:bookmarkEnd w:id="99"/>
+    <w:bookmarkStart w:id="101" w:name="ref-fudenberg2018"/>
     <w:p>
       <w:pPr>
         <w:pStyle w:val="Bibliography"/>
@@ -15042,7 +15240,7 @@
       <w:r>
         <w:t xml:space="preserve">Fudenberg D, Strack P, Strzalecki T. Speed, accuracy, and the optimal timing of choices. American Economic Review. 2018;108(12):3651–84. doi:</w:t>
       </w:r>
-      <w:hyperlink r:id="rId101">
+      <w:hyperlink r:id="rId100">
         <w:r>
           <w:rPr>
             <w:rStyle w:val="Hyperlink"/>
@@ -15051,8 +15249,8 @@
         </w:r>
       </w:hyperlink>
     </w:p>
-    <w:bookmarkEnd w:id="102"/>
-    <w:bookmarkStart w:id="104" w:name="ref-hebert2023"/>
+    <w:bookmarkEnd w:id="101"/>
+    <w:bookmarkStart w:id="103" w:name="ref-hebert2023"/>
     <w:p>
       <w:pPr>
         <w:pStyle w:val="Bibliography"/>
@@ -15069,7 +15267,7 @@
       <w:r>
         <w:t xml:space="preserve">Hébert B, Woodford M. Rational inattention when decisions take time. Journal of Economic Theory. 2023;208:105612. doi:</w:t>
       </w:r>
-      <w:hyperlink r:id="rId103">
+      <w:hyperlink r:id="rId102">
         <w:r>
           <w:rPr>
             <w:rStyle w:val="Hyperlink"/>
@@ -15078,8 +15276,8 @@
         </w:r>
       </w:hyperlink>
     </w:p>
-    <w:bookmarkEnd w:id="104"/>
-    <w:bookmarkStart w:id="106" w:name="ref-fromer2025"/>
+    <w:bookmarkEnd w:id="103"/>
+    <w:bookmarkStart w:id="105" w:name="ref-fromer2025"/>
     <w:p>
       <w:pPr>
         <w:pStyle w:val="Bibliography"/>
@@ -15096,7 +15294,7 @@
       <w:r>
         <w:t xml:space="preserve">Frömer R, Callaway F, Griffiths TL, Shenhav A. Considering what we know and what we don’t know: Expectations and confidence guide value integration in value-based decision-making. Open Mind: Discoveries in Cognitive Science. 2025;9:791–813. doi:</w:t>
       </w:r>
-      <w:hyperlink r:id="rId105">
+      <w:hyperlink r:id="rId104">
         <w:r>
           <w:rPr>
             <w:rStyle w:val="Hyperlink"/>
@@ -15105,8 +15303,8 @@
         </w:r>
       </w:hyperlink>
     </w:p>
-    <w:bookmarkEnd w:id="106"/>
-    <w:bookmarkStart w:id="108" w:name="ref-russell1991"/>
+    <w:bookmarkEnd w:id="105"/>
+    <w:bookmarkStart w:id="107" w:name="ref-russell1991"/>
     <w:p>
       <w:pPr>
         <w:pStyle w:val="Bibliography"/>
@@ -15123,7 +15321,7 @@
       <w:r>
         <w:t xml:space="preserve">Russell S, Wefald E. Principles of metareasoning. Artificial Intelligence. 1991;49(1-3):361–95. doi:</w:t>
       </w:r>
-      <w:hyperlink r:id="rId107">
+      <w:hyperlink r:id="rId106">
         <w:r>
           <w:rPr>
             <w:rStyle w:val="Hyperlink"/>
@@ -15132,8 +15330,8 @@
         </w:r>
       </w:hyperlink>
     </w:p>
-    <w:bookmarkEnd w:id="108"/>
-    <w:bookmarkStart w:id="110" w:name="ref-hay2012"/>
+    <w:bookmarkEnd w:id="107"/>
+    <w:bookmarkStart w:id="109" w:name="ref-hay2012"/>
     <w:p>
       <w:pPr>
         <w:pStyle w:val="Bibliography"/>
@@ -15162,7 +15360,7 @@
       <w:r>
         <w:t xml:space="preserve"> </w:t>
       </w:r>
-      <w:hyperlink r:id="rId109">
+      <w:hyperlink r:id="rId108">
         <w:r>
           <w:rPr>
             <w:rStyle w:val="Hyperlink"/>
@@ -15171,8 +15369,8 @@
         </w:r>
       </w:hyperlink>
     </w:p>
-    <w:bookmarkEnd w:id="110"/>
-    <w:bookmarkStart w:id="112" w:name="ref-lieder2020"/>
+    <w:bookmarkEnd w:id="109"/>
+    <w:bookmarkStart w:id="111" w:name="ref-lieder2020"/>
     <w:p>
       <w:pPr>
         <w:pStyle w:val="Bibliography"/>
@@ -15189,7 +15387,7 @@
       <w:r>
         <w:t xml:space="preserve">Lieder F, Griffiths TL. Resource-rational analysis: Understanding human cognition as the optimal use of limited computational resources. Behavioral and Brain Sciences. 2020;43:e1. doi:</w:t>
       </w:r>
-      <w:hyperlink r:id="rId111">
+      <w:hyperlink r:id="rId110">
         <w:r>
           <w:rPr>
             <w:rStyle w:val="Hyperlink"/>
@@ -15198,8 +15396,8 @@
         </w:r>
       </w:hyperlink>
     </w:p>
-    <w:bookmarkEnd w:id="112"/>
-    <w:bookmarkStart w:id="113" w:name="ref-lieder2026"/>
+    <w:bookmarkEnd w:id="111"/>
+    <w:bookmarkStart w:id="112" w:name="ref-lieder2026"/>
     <w:p>
       <w:pPr>
         <w:pStyle w:val="Bibliography"/>
@@ -15217,8 +15415,8 @@
         <w:t xml:space="preserve">Lieder F, Callaway F, Griffiths TL. The rational use of cognitive resources. Princeton, NJ: Princeton University Press; 2026.</w:t>
       </w:r>
     </w:p>
-    <w:bookmarkEnd w:id="113"/>
-    <w:bookmarkStart w:id="115" w:name="ref-simon1955"/>
+    <w:bookmarkEnd w:id="112"/>
+    <w:bookmarkStart w:id="114" w:name="ref-simon1955"/>
     <w:p>
       <w:pPr>
         <w:pStyle w:val="Bibliography"/>
@@ -15235,7 +15433,7 @@
       <w:r>
         <w:t xml:space="preserve">Simon HA. A behavioral model of rational choice. The Quarterly Journal of Economics. 1955;69(1):99–118. doi:</w:t>
       </w:r>
-      <w:hyperlink r:id="rId114">
+      <w:hyperlink r:id="rId113">
         <w:r>
           <w:rPr>
             <w:rStyle w:val="Hyperlink"/>
@@ -15244,8 +15442,8 @@
         </w:r>
       </w:hyperlink>
     </w:p>
-    <w:bookmarkEnd w:id="115"/>
-    <w:bookmarkStart w:id="117" w:name="ref-russell1995"/>
+    <w:bookmarkEnd w:id="114"/>
+    <w:bookmarkStart w:id="116" w:name="ref-russell1995"/>
     <w:p>
       <w:pPr>
         <w:pStyle w:val="Bibliography"/>
@@ -15262,7 +15460,7 @@
       <w:r>
         <w:t xml:space="preserve">Russell SJ, Subramanian D. Provably bounded-optimal agents. Journal of Artificial Intelligence Research. 1995;2:575–609. doi:</w:t>
       </w:r>
-      <w:hyperlink r:id="rId116">
+      <w:hyperlink r:id="rId115">
         <w:r>
           <w:rPr>
             <w:rStyle w:val="Hyperlink"/>
@@ -15271,8 +15469,8 @@
         </w:r>
       </w:hyperlink>
     </w:p>
-    <w:bookmarkEnd w:id="117"/>
-    <w:bookmarkStart w:id="119" w:name="ref-lewis2014"/>
+    <w:bookmarkEnd w:id="116"/>
+    <w:bookmarkStart w:id="118" w:name="ref-lewis2014"/>
     <w:p>
       <w:pPr>
         <w:pStyle w:val="Bibliography"/>
@@ -15289,7 +15487,7 @@
       <w:r>
         <w:t xml:space="preserve">Lewis RL, Howes A, Singh S. Computational rationality: Linking mechanism and behavior through bounded utility maximization. Topics in Cognitive Science. 2014;6(2):279–311. doi:</w:t>
       </w:r>
-      <w:hyperlink r:id="rId118">
+      <w:hyperlink r:id="rId117">
         <w:r>
           <w:rPr>
             <w:rStyle w:val="Hyperlink"/>
@@ -15298,8 +15496,8 @@
         </w:r>
       </w:hyperlink>
     </w:p>
-    <w:bookmarkEnd w:id="119"/>
-    <w:bookmarkStart w:id="121" w:name="ref-griffiths2015"/>
+    <w:bookmarkEnd w:id="118"/>
+    <w:bookmarkStart w:id="120" w:name="ref-griffiths2015"/>
     <w:p>
       <w:pPr>
         <w:pStyle w:val="Bibliography"/>
@@ -15316,7 +15514,7 @@
       <w:r>
         <w:t xml:space="preserve">Griffiths TL, Lieder F, Goodman ND. Rational use of cognitive resources: Levels of analysis between the computational and the algorithmic. Topics in Cognitive Science. 2015;7(2):217–29. doi:</w:t>
       </w:r>
-      <w:hyperlink r:id="rId120">
+      <w:hyperlink r:id="rId119">
         <w:r>
           <w:rPr>
             <w:rStyle w:val="Hyperlink"/>
@@ -15325,8 +15523,8 @@
         </w:r>
       </w:hyperlink>
     </w:p>
-    <w:bookmarkEnd w:id="121"/>
-    <w:bookmarkStart w:id="123" w:name="ref-gershman2015"/>
+    <w:bookmarkEnd w:id="120"/>
+    <w:bookmarkStart w:id="122" w:name="ref-gershman2015"/>
     <w:p>
       <w:pPr>
         <w:pStyle w:val="Bibliography"/>
@@ -15343,7 +15541,7 @@
       <w:r>
         <w:t xml:space="preserve">Gershman SJ, Horvitz EJ, Tenenbaum JB. Computational rationality: A converging paradigm for intelligence in brains, minds, and machines. Science. 2015;349(6245):273–8. doi:</w:t>
       </w:r>
-      <w:hyperlink r:id="rId122">
+      <w:hyperlink r:id="rId121">
         <w:r>
           <w:rPr>
             <w:rStyle w:val="Hyperlink"/>
@@ -15352,8 +15550,8 @@
         </w:r>
       </w:hyperlink>
     </w:p>
-    <w:bookmarkEnd w:id="123"/>
-    <w:bookmarkStart w:id="125" w:name="ref-najemnik2005"/>
+    <w:bookmarkEnd w:id="122"/>
+    <w:bookmarkStart w:id="124" w:name="ref-najemnik2005"/>
     <w:p>
       <w:pPr>
         <w:pStyle w:val="Bibliography"/>
@@ -15370,7 +15568,7 @@
       <w:r>
         <w:t xml:space="preserve">Najemnik J, Geisler WS. Optimal eye movement strategies in visual search. Nature. 2005;434(7031):387–91. doi:</w:t>
       </w:r>
-      <w:hyperlink r:id="rId124">
+      <w:hyperlink r:id="rId123">
         <w:r>
           <w:rPr>
             <w:rStyle w:val="Hyperlink"/>
@@ -15379,8 +15577,8 @@
         </w:r>
       </w:hyperlink>
     </w:p>
-    <w:bookmarkEnd w:id="125"/>
-    <w:bookmarkStart w:id="127" w:name="ref-yang2016"/>
+    <w:bookmarkEnd w:id="124"/>
+    <w:bookmarkStart w:id="126" w:name="ref-yang2016"/>
     <w:p>
       <w:pPr>
         <w:pStyle w:val="Bibliography"/>
@@ -15397,7 +15595,7 @@
       <w:r>
         <w:t xml:space="preserve">Yang SCH, Lengyel M, Wolpert DM. Active sensing in the categorization of visual patterns. eLife. 2016;5:e12215. doi:</w:t>
       </w:r>
-      <w:hyperlink r:id="rId126">
+      <w:hyperlink r:id="rId125">
         <w:r>
           <w:rPr>
             <w:rStyle w:val="Hyperlink"/>
@@ -15406,8 +15604,8 @@
         </w:r>
       </w:hyperlink>
     </w:p>
-    <w:bookmarkEnd w:id="127"/>
-    <w:bookmarkStart w:id="129" w:name="ref-gottlieb2012"/>
+    <w:bookmarkEnd w:id="126"/>
+    <w:bookmarkStart w:id="128" w:name="ref-gottlieb2012"/>
     <w:p>
       <w:pPr>
         <w:pStyle w:val="Bibliography"/>
@@ -15424,7 +15622,7 @@
       <w:r>
         <w:t xml:space="preserve">Gottlieb J. Attention, learning, and the value of information. Neuron. 2012;76(2):281–95. doi:</w:t>
       </w:r>
-      <w:hyperlink r:id="rId128">
+      <w:hyperlink r:id="rId127">
         <w:r>
           <w:rPr>
             <w:rStyle w:val="Hyperlink"/>
@@ -15433,8 +15631,8 @@
         </w:r>
       </w:hyperlink>
     </w:p>
-    <w:bookmarkEnd w:id="129"/>
-    <w:bookmarkStart w:id="131" w:name="ref-hoppe2016"/>
+    <w:bookmarkEnd w:id="128"/>
+    <w:bookmarkStart w:id="130" w:name="ref-hoppe2016"/>
     <w:p>
       <w:pPr>
         <w:pStyle w:val="Bibliography"/>
@@ -15451,7 +15649,7 @@
       <w:r>
         <w:t xml:space="preserve">Hoppe D, Rothkopf CA. Learning rational temporal eye movement strategies. Proceedings of the National Academy of Sciences. 2016;113(29):8332–7. doi:</w:t>
       </w:r>
-      <w:hyperlink r:id="rId130">
+      <w:hyperlink r:id="rId129">
         <w:r>
           <w:rPr>
             <w:rStyle w:val="Hyperlink"/>
@@ -15460,8 +15658,8 @@
         </w:r>
       </w:hyperlink>
     </w:p>
-    <w:bookmarkEnd w:id="131"/>
-    <w:bookmarkStart w:id="133" w:name="ref-callaway2022"/>
+    <w:bookmarkEnd w:id="130"/>
+    <w:bookmarkStart w:id="132" w:name="ref-callaway2022"/>
     <w:p>
       <w:pPr>
         <w:pStyle w:val="Bibliography"/>
@@ -15478,7 +15676,7 @@
       <w:r>
         <w:t xml:space="preserve">Callaway F, Opheusden B van, Gul S, Das P, Krueger PM, Griffiths TL, et al. Rational use of cognitive resources in human planning. Nature Human Behaviour. 2022;6(8):1112–25. doi:</w:t>
       </w:r>
-      <w:hyperlink r:id="rId132">
+      <w:hyperlink r:id="rId131">
         <w:r>
           <w:rPr>
             <w:rStyle w:val="Hyperlink"/>
@@ -15487,8 +15685,8 @@
         </w:r>
       </w:hyperlink>
     </w:p>
-    <w:bookmarkEnd w:id="133"/>
-    <w:bookmarkStart w:id="135" w:name="ref-callaway2024"/>
+    <w:bookmarkEnd w:id="132"/>
+    <w:bookmarkStart w:id="134" w:name="ref-callaway2024"/>
     <w:p>
       <w:pPr>
         <w:pStyle w:val="Bibliography"/>
@@ -15505,7 +15703,7 @@
       <w:r>
         <w:t xml:space="preserve">Callaway F, Griffiths TL, Norman KA, Zhang Q. Optimal metacognitive control of memory recall. Psychological Review. 2024;131(3):781–811. doi:</w:t>
       </w:r>
-      <w:hyperlink r:id="rId134">
+      <w:hyperlink r:id="rId133">
         <w:r>
           <w:rPr>
             <w:rStyle w:val="Hyperlink"/>
@@ -15514,8 +15712,8 @@
         </w:r>
       </w:hyperlink>
     </w:p>
-    <w:bookmarkEnd w:id="135"/>
-    <w:bookmarkStart w:id="137" w:name="ref-ma2026"/>
+    <w:bookmarkEnd w:id="134"/>
+    <w:bookmarkStart w:id="136" w:name="ref-ma2026"/>
     <w:p>
       <w:pPr>
         <w:pStyle w:val="Bibliography"/>
@@ -15532,7 +15730,7 @@
       <w:r>
         <w:t xml:space="preserve">Ma S, Popov V, Zhang Q. Cognitive constraints and reward environments jointly shape memory formation. Psychological Review. 2026. doi:</w:t>
       </w:r>
-      <w:hyperlink r:id="rId136">
+      <w:hyperlink r:id="rId135">
         <w:r>
           <w:rPr>
             <w:rStyle w:val="Hyperlink"/>
@@ -15541,8 +15739,8 @@
         </w:r>
       </w:hyperlink>
     </w:p>
-    <w:bookmarkEnd w:id="137"/>
-    <w:bookmarkStart w:id="139" w:name="ref-reutskaja2011"/>
+    <w:bookmarkEnd w:id="136"/>
+    <w:bookmarkStart w:id="138" w:name="ref-reutskaja2011"/>
     <w:p>
       <w:pPr>
         <w:pStyle w:val="Bibliography"/>
@@ -15559,7 +15757,7 @@
       <w:r>
         <w:t xml:space="preserve">Reutskaja E, Nagel R, Camerer CF, Rangel A. Search dynamics in consumer choice under time pressure: An eye-tracking study. American Economic Review. 2011;101(2):900–26. doi:</w:t>
       </w:r>
-      <w:hyperlink r:id="rId138">
+      <w:hyperlink r:id="rId137">
         <w:r>
           <w:rPr>
             <w:rStyle w:val="Hyperlink"/>
@@ -15568,8 +15766,8 @@
         </w:r>
       </w:hyperlink>
     </w:p>
-    <w:bookmarkEnd w:id="139"/>
-    <w:bookmarkStart w:id="141" w:name="ref-russo1994"/>
+    <w:bookmarkEnd w:id="138"/>
+    <w:bookmarkStart w:id="140" w:name="ref-russo1994"/>
     <w:p>
       <w:pPr>
         <w:pStyle w:val="Bibliography"/>
@@ -15586,7 +15784,7 @@
       <w:r>
         <w:t xml:space="preserve">Russo JE, Leclerc F. An eye-fixation analysis of choice processes for consumer nondurables. Journal of Consumer Research. 1994;21(2):274–90. doi:</w:t>
       </w:r>
-      <w:hyperlink r:id="rId140">
+      <w:hyperlink r:id="rId139">
         <w:r>
           <w:rPr>
             <w:rStyle w:val="Hyperlink"/>
@@ -15595,8 +15793,8 @@
         </w:r>
       </w:hyperlink>
     </w:p>
-    <w:bookmarkEnd w:id="141"/>
-    <w:bookmarkStart w:id="143" w:name="ref-gluth2018"/>
+    <w:bookmarkEnd w:id="140"/>
+    <w:bookmarkStart w:id="142" w:name="ref-gluth2018"/>
     <w:p>
       <w:pPr>
         <w:pStyle w:val="Bibliography"/>
@@ -15613,7 +15811,7 @@
       <w:r>
         <w:t xml:space="preserve">Gluth S, Spektor MS, Rieskamp J. Value-based attentional capture affects multi-alternative decision making. eLife. 2018;7:e39659. doi:</w:t>
       </w:r>
-      <w:hyperlink r:id="rId142">
+      <w:hyperlink r:id="rId141">
         <w:r>
           <w:rPr>
             <w:rStyle w:val="Hyperlink"/>
@@ -15622,8 +15820,8 @@
         </w:r>
       </w:hyperlink>
     </w:p>
-    <w:bookmarkEnd w:id="143"/>
-    <w:bookmarkStart w:id="145" w:name="ref-gluth2020"/>
+    <w:bookmarkEnd w:id="142"/>
+    <w:bookmarkStart w:id="144" w:name="ref-gluth2020"/>
     <w:p>
       <w:pPr>
         <w:pStyle w:val="Bibliography"/>
@@ -15640,7 +15838,7 @@
       <w:r>
         <w:t xml:space="preserve">Gluth S, Kern N, Kortmann M, Vitali CL. Value-based attention but not divisive normalization influences decisions with multiple alternatives. Nature Human Behaviour. 2020;4(6):634–45. doi:</w:t>
       </w:r>
-      <w:hyperlink r:id="rId144">
+      <w:hyperlink r:id="rId143">
         <w:r>
           <w:rPr>
             <w:rStyle w:val="Hyperlink"/>
@@ -15649,8 +15847,8 @@
         </w:r>
       </w:hyperlink>
     </w:p>
-    <w:bookmarkEnd w:id="145"/>
-    <w:bookmarkStart w:id="147" w:name="ref-fromer2026"/>
+    <w:bookmarkEnd w:id="144"/>
+    <w:bookmarkStart w:id="146" w:name="ref-fromer2026"/>
     <w:p>
       <w:pPr>
         <w:pStyle w:val="Bibliography"/>
@@ -15667,7 +15865,7 @@
       <w:r>
         <w:t xml:space="preserve">Froemer R, Ting CC, Shenhav A, Gluth S. Goals shape dynamics of attention and selection for value-based decisions. Topics in Cognitive Science. 2026;e70076. doi:</w:t>
       </w:r>
-      <w:hyperlink r:id="rId146">
+      <w:hyperlink r:id="rId145">
         <w:r>
           <w:rPr>
             <w:rStyle w:val="Hyperlink"/>
@@ -15676,8 +15874,8 @@
         </w:r>
       </w:hyperlink>
     </w:p>
-    <w:bookmarkEnd w:id="147"/>
-    <w:bookmarkStart w:id="149" w:name="ref-fromer2019"/>
+    <w:bookmarkEnd w:id="146"/>
+    <w:bookmarkStart w:id="148" w:name="ref-fromer2019"/>
     <w:p>
       <w:pPr>
         <w:pStyle w:val="Bibliography"/>
@@ -15694,7 +15892,7 @@
       <w:r>
         <w:t xml:space="preserve">Frömer R, Dean Wolf CK, Shenhav A. Goal congruency dominates reward value in accounting for behavioral and neural correlates of value-based decision-making. Nature Communications. 2019;10:4926. doi:</w:t>
       </w:r>
-      <w:hyperlink r:id="rId148">
+      <w:hyperlink r:id="rId147">
         <w:r>
           <w:rPr>
             <w:rStyle w:val="Hyperlink"/>
@@ -15703,8 +15901,8 @@
         </w:r>
       </w:hyperlink>
     </w:p>
-    <w:bookmarkEnd w:id="149"/>
-    <w:bookmarkStart w:id="151" w:name="ref-sepulveda2020"/>
+    <w:bookmarkEnd w:id="148"/>
+    <w:bookmarkStart w:id="150" w:name="ref-sepulveda2020"/>
     <w:p>
       <w:pPr>
         <w:pStyle w:val="Bibliography"/>
@@ -15721,7 +15919,7 @@
       <w:r>
         <w:t xml:space="preserve">Sepulveda P, Usher M, Davies N, Benson AA, Ortoleva P, De Martino B. Visual attention modulates the integration of goal-relevant evidence and not value. eLife. 2020;9:e60705. doi:</w:t>
       </w:r>
-      <w:hyperlink r:id="rId150">
+      <w:hyperlink r:id="rId149">
         <w:r>
           <w:rPr>
             <w:rStyle w:val="Hyperlink"/>
@@ -15730,8 +15928,8 @@
         </w:r>
       </w:hyperlink>
     </w:p>
-    <w:bookmarkEnd w:id="151"/>
-    <w:bookmarkStart w:id="153" w:name="ref-kovach2014"/>
+    <w:bookmarkEnd w:id="150"/>
+    <w:bookmarkStart w:id="152" w:name="ref-kovach2014"/>
     <w:p>
       <w:pPr>
         <w:pStyle w:val="Bibliography"/>
@@ -15748,7 +15946,7 @@
       <w:r>
         <w:t xml:space="preserve">Kovach CK, Sutterer MJ, Rushia SN, Teriakidis A, Jenison RL. Two systems drive attention to rewards. Frontiers in Psychology. 2014;5:46. doi:</w:t>
       </w:r>
-      <w:hyperlink r:id="rId152">
+      <w:hyperlink r:id="rId151">
         <w:r>
           <w:rPr>
             <w:rStyle w:val="Hyperlink"/>
@@ -15757,8 +15955,8 @@
         </w:r>
       </w:hyperlink>
     </w:p>
-    <w:bookmarkEnd w:id="153"/>
-    <w:bookmarkStart w:id="155" w:name="ref-simonson1990"/>
+    <w:bookmarkEnd w:id="152"/>
+    <w:bookmarkStart w:id="154" w:name="ref-simonson1990"/>
     <w:p>
       <w:pPr>
         <w:pStyle w:val="Bibliography"/>
@@ -15775,7 +15973,7 @@
       <w:r>
         <w:t xml:space="preserve">Simonson I. The effect of purchase quantity and timing on variety-seeking behavior. Journal of Marketing Research. 1990;27(2):150–62. doi:</w:t>
       </w:r>
-      <w:hyperlink r:id="rId154">
+      <w:hyperlink r:id="rId153">
         <w:r>
           <w:rPr>
             <w:rStyle w:val="Hyperlink"/>
@@ -15784,8 +15982,8 @@
         </w:r>
       </w:hyperlink>
     </w:p>
-    <w:bookmarkEnd w:id="155"/>
-    <w:bookmarkStart w:id="157" w:name="ref-read1995"/>
+    <w:bookmarkEnd w:id="154"/>
+    <w:bookmarkStart w:id="156" w:name="ref-read1995"/>
     <w:p>
       <w:pPr>
         <w:pStyle w:val="Bibliography"/>
@@ -15802,7 +16000,7 @@
       <w:r>
         <w:t xml:space="preserve">Read D, Loewenstein G. Diversification bias: Explaining the discrepancy in variety seeking between combined and separated choices. Journal of Experimental Psychology: Applied. 1995;1(1):34–49. doi:</w:t>
       </w:r>
-      <w:hyperlink r:id="rId156">
+      <w:hyperlink r:id="rId155">
         <w:r>
           <w:rPr>
             <w:rStyle w:val="Hyperlink"/>
@@ -15811,8 +16009,8 @@
         </w:r>
       </w:hyperlink>
     </w:p>
-    <w:bookmarkEnd w:id="157"/>
-    <w:bookmarkStart w:id="159" w:name="ref-leng2025"/>
+    <w:bookmarkEnd w:id="156"/>
+    <w:bookmarkStart w:id="158" w:name="ref-leng2025"/>
     <w:p>
       <w:pPr>
         <w:pStyle w:val="Bibliography"/>
@@ -15829,7 +16027,7 @@
       <w:r>
         <w:t xml:space="preserve">Leng X, Frömer R, Summe T, Shenhav A. Mutual inclusivity improves decision-making by smoothing out choice’s competitive edge. Nature Human Behaviour. 2025;9(3):521–33. doi:</w:t>
       </w:r>
-      <w:hyperlink r:id="rId158">
+      <w:hyperlink r:id="rId157">
         <w:r>
           <w:rPr>
             <w:rStyle w:val="Hyperlink"/>
@@ -15838,8 +16036,8 @@
         </w:r>
       </w:hyperlink>
     </w:p>
-    <w:bookmarkEnd w:id="159"/>
-    <w:bookmarkStart w:id="161" w:name="ref-gabaix2005"/>
+    <w:bookmarkEnd w:id="158"/>
+    <w:bookmarkStart w:id="160" w:name="ref-gabaix2005"/>
     <w:p>
       <w:pPr>
         <w:pStyle w:val="Bibliography"/>
@@ -15859,7 +16057,7 @@
       <w:r>
         <w:t xml:space="preserve"> </w:t>
       </w:r>
-      <w:hyperlink r:id="rId160">
+      <w:hyperlink r:id="rId159">
         <w:r>
           <w:rPr>
             <w:rStyle w:val="Hyperlink"/>
@@ -15868,8 +16066,8 @@
         </w:r>
       </w:hyperlink>
     </w:p>
-    <w:bookmarkEnd w:id="161"/>
-    <w:bookmarkStart w:id="163" w:name="ref-gabaix2006"/>
+    <w:bookmarkEnd w:id="160"/>
+    <w:bookmarkStart w:id="162" w:name="ref-gabaix2006"/>
     <w:p>
       <w:pPr>
         <w:pStyle w:val="Bibliography"/>
@@ -15886,7 +16084,7 @@
       <w:r>
         <w:t xml:space="preserve">Gabaix X, Laibson D, Moloche G, Weinberg S. Costly information acquisition: Experimental analysis of a boundedly rational model. American Economic Review. 2006;96(4):1043–68. doi:</w:t>
       </w:r>
-      <w:hyperlink r:id="rId162">
+      <w:hyperlink r:id="rId161">
         <w:r>
           <w:rPr>
             <w:rStyle w:val="Hyperlink"/>
@@ -15895,8 +16093,8 @@
         </w:r>
       </w:hyperlink>
     </w:p>
-    <w:bookmarkEnd w:id="163"/>
-    <w:bookmarkStart w:id="165" w:name="ref-callaway2018"/>
+    <w:bookmarkEnd w:id="162"/>
+    <w:bookmarkStart w:id="164" w:name="ref-callaway2018"/>
     <w:p>
       <w:pPr>
         <w:pStyle w:val="Bibliography"/>
@@ -15925,7 +16123,7 @@
       <w:r>
         <w:t xml:space="preserve"> </w:t>
       </w:r>
-      <w:hyperlink r:id="rId164">
+      <w:hyperlink r:id="rId163">
         <w:r>
           <w:rPr>
             <w:rStyle w:val="Hyperlink"/>
@@ -15934,8 +16132,8 @@
         </w:r>
       </w:hyperlink>
     </w:p>
-    <w:bookmarkEnd w:id="165"/>
-    <w:bookmarkStart w:id="167" w:name="ref-orquin2013"/>
+    <w:bookmarkEnd w:id="164"/>
+    <w:bookmarkStart w:id="166" w:name="ref-orquin2013"/>
     <w:p>
       <w:pPr>
         <w:pStyle w:val="Bibliography"/>
@@ -15952,7 +16150,7 @@
       <w:r>
         <w:t xml:space="preserve">Orquin JL, Mueller Loose S. Attention and choice: A review on eye movements in decision making. Acta Psychologica. 2013;144(1):190–206. doi:</w:t>
       </w:r>
-      <w:hyperlink r:id="rId166">
+      <w:hyperlink r:id="rId165">
         <w:r>
           <w:rPr>
             <w:rStyle w:val="Hyperlink"/>
@@ -15961,8 +16159,8 @@
         </w:r>
       </w:hyperlink>
     </w:p>
-    <w:bookmarkEnd w:id="167"/>
-    <w:bookmarkStart w:id="169" w:name="ref-maris2007"/>
+    <w:bookmarkEnd w:id="166"/>
+    <w:bookmarkStart w:id="168" w:name="ref-maris2007"/>
     <w:p>
       <w:pPr>
         <w:pStyle w:val="Bibliography"/>
@@ -15997,7 +16195,7 @@
       <w:r>
         <w:t xml:space="preserve">-data. Journal of Neuroscience Methods. 2007;164(1):177–90. doi:</w:t>
       </w:r>
-      <w:hyperlink r:id="rId168">
+      <w:hyperlink r:id="rId167">
         <w:r>
           <w:rPr>
             <w:rStyle w:val="Hyperlink"/>
@@ -16006,8 +16204,8 @@
         </w:r>
       </w:hyperlink>
     </w:p>
-    <w:bookmarkEnd w:id="169"/>
-    <w:bookmarkStart w:id="171" w:name="ref-payne1988"/>
+    <w:bookmarkEnd w:id="168"/>
+    <w:bookmarkStart w:id="170" w:name="ref-payne1988"/>
     <w:p>
       <w:pPr>
         <w:pStyle w:val="Bibliography"/>
@@ -16024,7 +16222,7 @@
       <w:r>
         <w:t xml:space="preserve">Payne JW, Bettman JR, Johnson EJ. Adaptive strategy selection in decision making. Journal of Experimental Psychology: Learning, Memory, and Cognition. 1988;14(3):534–52. doi:</w:t>
       </w:r>
-      <w:hyperlink r:id="rId170">
+      <w:hyperlink r:id="rId169">
         <w:r>
           <w:rPr>
             <w:rStyle w:val="Hyperlink"/>
@@ -16033,8 +16231,8 @@
         </w:r>
       </w:hyperlink>
     </w:p>
-    <w:bookmarkEnd w:id="171"/>
-    <w:bookmarkStart w:id="173" w:name="ref-lieder2017"/>
+    <w:bookmarkEnd w:id="170"/>
+    <w:bookmarkStart w:id="172" w:name="ref-lieder2017"/>
     <w:p>
       <w:pPr>
         <w:pStyle w:val="Bibliography"/>
@@ -16051,7 +16249,7 @@
       <w:r>
         <w:t xml:space="preserve">Lieder F, Griffiths TL. Strategy selection as rational metareasoning. Psychological Review. 2017;124(6):762–94. doi:</w:t>
       </w:r>
-      <w:hyperlink r:id="rId172">
+      <w:hyperlink r:id="rId171">
         <w:r>
           <w:rPr>
             <w:rStyle w:val="Hyperlink"/>
@@ -16060,8 +16258,8 @@
         </w:r>
       </w:hyperlink>
     </w:p>
-    <w:bookmarkEnd w:id="173"/>
-    <w:bookmarkStart w:id="175" w:name="ref-shenhav2017"/>
+    <w:bookmarkEnd w:id="172"/>
+    <w:bookmarkStart w:id="174" w:name="ref-shenhav2017"/>
     <w:p>
       <w:pPr>
         <w:pStyle w:val="Bibliography"/>
@@ -16078,7 +16276,7 @@
       <w:r>
         <w:t xml:space="preserve">Shenhav A, Musslick S, Lieder F, Kool W, Griffiths TL, Cohen JD, et al. Toward a rational and mechanistic account of mental effort. Annual Review of Neuroscience. 2017;40:99–124. doi:</w:t>
       </w:r>
-      <w:hyperlink r:id="rId174">
+      <w:hyperlink r:id="rId173">
         <w:r>
           <w:rPr>
             <w:rStyle w:val="Hyperlink"/>
@@ -16087,8 +16285,8 @@
         </w:r>
       </w:hyperlink>
     </w:p>
-    <w:bookmarkEnd w:id="175"/>
-    <w:bookmarkStart w:id="177" w:name="ref-kool2018"/>
+    <w:bookmarkEnd w:id="174"/>
+    <w:bookmarkStart w:id="176" w:name="ref-kool2018"/>
     <w:p>
       <w:pPr>
         <w:pStyle w:val="Bibliography"/>
@@ -16105,7 +16303,7 @@
       <w:r>
         <w:t xml:space="preserve">Kool W, Botvinick M. Mental labour. Nature Human Behaviour. 2018;2(12):899–908. doi:</w:t>
       </w:r>
-      <w:hyperlink r:id="rId176">
+      <w:hyperlink r:id="rId175">
         <w:r>
           <w:rPr>
             <w:rStyle w:val="Hyperlink"/>
@@ -16114,8 +16312,8 @@
         </w:r>
       </w:hyperlink>
     </w:p>
-    <w:bookmarkEnd w:id="177"/>
-    <w:bookmarkStart w:id="179" w:name="ref-krueger2024"/>
+    <w:bookmarkEnd w:id="176"/>
+    <w:bookmarkStart w:id="178" w:name="ref-krueger2024"/>
     <w:p>
       <w:pPr>
         <w:pStyle w:val="Bibliography"/>
@@ -16132,7 +16330,7 @@
       <w:r>
         <w:t xml:space="preserve">Krueger PM, Callaway F, Gul S, Griffiths TL, Lieder F. Identifying resource-rational heuristics for risky choice. Psychological Review. 2024;131(4):905–51. doi:</w:t>
       </w:r>
-      <w:hyperlink r:id="rId178">
+      <w:hyperlink r:id="rId177">
         <w:r>
           <w:rPr>
             <w:rStyle w:val="Hyperlink"/>
@@ -16141,8 +16339,8 @@
         </w:r>
       </w:hyperlink>
     </w:p>
-    <w:bookmarkEnd w:id="179"/>
-    <w:bookmarkStart w:id="181" w:name="ref-deleeuw2015"/>
+    <w:bookmarkEnd w:id="178"/>
+    <w:bookmarkStart w:id="180" w:name="ref-deleeuw2015"/>
     <w:p>
       <w:pPr>
         <w:pStyle w:val="Bibliography"/>
@@ -16192,7 +16390,7 @@
       <w:r>
         <w:t xml:space="preserve">browser. Behavior Research Methods. 2015;47(1):1–12. doi:</w:t>
       </w:r>
-      <w:hyperlink r:id="rId180">
+      <w:hyperlink r:id="rId179">
         <w:r>
           <w:rPr>
             <w:rStyle w:val="Hyperlink"/>
@@ -16201,8 +16399,8 @@
         </w:r>
       </w:hyperlink>
     </w:p>
-    <w:bookmarkEnd w:id="181"/>
-    <w:bookmarkStart w:id="183" w:name="ref-papoutsaki2016"/>
+    <w:bookmarkEnd w:id="180"/>
+    <w:bookmarkStart w:id="182" w:name="ref-papoutsaki2016"/>
     <w:p>
       <w:pPr>
         <w:pStyle w:val="Bibliography"/>
@@ -16237,7 +16435,7 @@
       <w:r>
         <w:t xml:space="preserve"> </w:t>
       </w:r>
-      <w:hyperlink r:id="rId182">
+      <w:hyperlink r:id="rId181">
         <w:r>
           <w:rPr>
             <w:rStyle w:val="Hyperlink"/>
@@ -16246,8 +16444,8 @@
         </w:r>
       </w:hyperlink>
     </w:p>
-    <w:bookmarkEnd w:id="183"/>
-    <w:bookmarkStart w:id="185" w:name="ref-yang2021"/>
+    <w:bookmarkEnd w:id="182"/>
+    <w:bookmarkStart w:id="184" w:name="ref-yang2021"/>
     <w:p>
       <w:pPr>
         <w:pStyle w:val="Bibliography"/>
@@ -16264,7 +16462,7 @@
       <w:r>
         <w:t xml:space="preserve">Yang X, Krajbich I. Webcam-based online eye-tracking for behavioral research. Judgment and Decision Making. 2021;16(6):1485–505. doi:</w:t>
       </w:r>
-      <w:hyperlink r:id="rId184">
+      <w:hyperlink r:id="rId183">
         <w:r>
           <w:rPr>
             <w:rStyle w:val="Hyperlink"/>
@@ -16273,8 +16471,8 @@
         </w:r>
       </w:hyperlink>
     </w:p>
-    <w:bookmarkEnd w:id="185"/>
-    <w:bookmarkStart w:id="187" w:name="ref-semmelmann2018"/>
+    <w:bookmarkEnd w:id="184"/>
+    <w:bookmarkStart w:id="186" w:name="ref-semmelmann2018"/>
     <w:p>
       <w:pPr>
         <w:pStyle w:val="Bibliography"/>
@@ -16291,7 +16489,7 @@
       <w:r>
         <w:t xml:space="preserve">Semmelmann K, Weigelt S. Online webcam-based eye tracking in cognitive science: A first look. Behavior Research Methods. 2018;50(2):451–65. doi:</w:t>
       </w:r>
-      <w:hyperlink r:id="rId186">
+      <w:hyperlink r:id="rId185">
         <w:r>
           <w:rPr>
             <w:rStyle w:val="Hyperlink"/>
@@ -16300,8 +16498,8 @@
         </w:r>
       </w:hyperlink>
     </w:p>
-    <w:bookmarkEnd w:id="187"/>
-    <w:bookmarkStart w:id="189" w:name="ref-bezanson2017"/>
+    <w:bookmarkEnd w:id="186"/>
+    <w:bookmarkStart w:id="188" w:name="ref-bezanson2017"/>
     <w:p>
       <w:pPr>
         <w:pStyle w:val="Bibliography"/>
@@ -16327,7 +16525,7 @@
       <w:r>
         <w:t xml:space="preserve">: A fresh approach to numerical computing. SIAM Review. 2017;59(1):65–98. doi:</w:t>
       </w:r>
-      <w:hyperlink r:id="rId188">
+      <w:hyperlink r:id="rId187">
         <w:r>
           <w:rPr>
             <w:rStyle w:val="Hyperlink"/>
@@ -16336,8 +16534,8 @@
         </w:r>
       </w:hyperlink>
     </w:p>
-    <w:bookmarkEnd w:id="189"/>
-    <w:bookmarkStart w:id="191" w:name="ref-bates2015"/>
+    <w:bookmarkEnd w:id="188"/>
+    <w:bookmarkStart w:id="190" w:name="ref-bates2015"/>
     <w:p>
       <w:pPr>
         <w:pStyle w:val="Bibliography"/>
@@ -16363,7 +16561,7 @@
       <w:r>
         <w:t xml:space="preserve">. Journal of Statistical Software. 2015;67(1):1–48. doi:</w:t>
       </w:r>
-      <w:hyperlink r:id="rId190">
+      <w:hyperlink r:id="rId189">
         <w:r>
           <w:rPr>
             <w:rStyle w:val="Hyperlink"/>
@@ -16372,8 +16570,8 @@
         </w:r>
       </w:hyperlink>
     </w:p>
-    <w:bookmarkEnd w:id="191"/>
-    <w:bookmarkStart w:id="193" w:name="ref-rcoreteam2025"/>
+    <w:bookmarkEnd w:id="190"/>
+    <w:bookmarkStart w:id="192" w:name="ref-rcoreteam2025"/>
     <w:p>
       <w:pPr>
         <w:pStyle w:val="Bibliography"/>
@@ -16393,7 +16591,7 @@
       <w:r>
         <w:t xml:space="preserve"> </w:t>
       </w:r>
-      <w:hyperlink r:id="rId192">
+      <w:hyperlink r:id="rId191">
         <w:r>
           <w:rPr>
             <w:rStyle w:val="Hyperlink"/>
@@ -16402,10 +16600,10 @@
         </w:r>
       </w:hyperlink>
     </w:p>
+    <w:bookmarkEnd w:id="192"/>
     <w:bookmarkEnd w:id="193"/>
     <w:bookmarkEnd w:id="194"/>
-    <w:bookmarkEnd w:id="195"/>
-    <w:bookmarkStart w:id="205" w:name="Xc69cd6e803bfffecb1c25fddf9e46ca13c121b8"/>
+    <w:bookmarkStart w:id="204" w:name="Xc69cd6e803bfffecb1c25fddf9e46ca13c121b8"/>
     <w:p>
       <w:pPr>
         <w:pStyle w:val="Heading1"/>
@@ -16422,7 +16620,7 @@
         <w:t xml:space="preserve">Equation numbers refer to the main text.</w:t>
       </w:r>
     </w:p>
-    <w:bookmarkStart w:id="196" w:name="X7c01e28133c15b07462cebe3d8d9b77a0f71cb5"/>
+    <w:bookmarkStart w:id="195" w:name="X7c01e28133c15b07462cebe3d8d9b77a0f71cb5"/>
     <w:p>
       <w:pPr>
         <w:pStyle w:val="Heading2"/>
@@ -17451,8 +17649,8 @@
         <w:t xml:space="preserve">: the posterior mean is a martingale. The beliefs about the other items do not change.</w:t>
       </w:r>
     </w:p>
-    <w:bookmarkEnd w:id="196"/>
-    <w:bookmarkStart w:id="197" w:name="X70a69b293eabf2c8862f70853439d6abd613caf"/>
+    <w:bookmarkEnd w:id="195"/>
+    <w:bookmarkStart w:id="196" w:name="X70a69b293eabf2c8862f70853439d6abd613caf"/>
     <w:p>
       <w:pPr>
         <w:pStyle w:val="Heading2"/>
@@ -20507,8 +20705,8 @@
         <w:t xml:space="preserve">for every non-leading item, and the second case reduces to the value of sampling the leader against the runner-up. These are the quantities that drive attention to the top two items in Callaway et al. (2021).</w:t>
       </w:r>
     </w:p>
-    <w:bookmarkEnd w:id="197"/>
-    <w:bookmarkStart w:id="198" w:name="X9501e0a3d5a35c17890f48526cba02c2faffb55"/>
+    <w:bookmarkEnd w:id="196"/>
+    <w:bookmarkStart w:id="197" w:name="X9501e0a3d5a35c17890f48526cba02c2faffb55"/>
     <w:p>
       <w:pPr>
         <w:pStyle w:val="Heading2"/>
@@ -21135,8 +21333,8 @@
         <w:t xml:space="preserve">in every case we examined.</w:t>
       </w:r>
     </w:p>
-    <w:bookmarkEnd w:id="198"/>
-    <w:bookmarkStart w:id="199" w:name="d.-selecting-k-items-is-rejecting-n---k"/>
+    <w:bookmarkEnd w:id="197"/>
+    <w:bookmarkStart w:id="198" w:name="d.-selecting-k-items-is-rejecting-n---k"/>
     <w:p>
       <w:pPr>
         <w:pStyle w:val="Heading2"/>
@@ -22789,8 +22987,8 @@
         <w:t xml:space="preserve">policy allocates to the two highest (Fig 2).</w:t>
       </w:r>
     </w:p>
-    <w:bookmarkEnd w:id="199"/>
-    <w:bookmarkStart w:id="200" w:name="e.-the-response-policies-as-algorithms"/>
+    <w:bookmarkEnd w:id="198"/>
+    <w:bookmarkStart w:id="199" w:name="e.-the-response-policies-as-algorithms"/>
     <w:p>
       <w:pPr>
         <w:pStyle w:val="Heading2"/>
@@ -24707,8 +24905,8 @@
         <w:t xml:space="preserve">In every policy, consecutive samples of the same item are concatenated into one fixation, each sample lasts 100 ms, and the response times are the sample counts at which items are committed.</w:t>
       </w:r>
     </w:p>
-    <w:bookmarkEnd w:id="200"/>
-    <w:bookmarkStart w:id="201" w:name="f.-parameter-search"/>
+    <w:bookmarkEnd w:id="199"/>
+    <w:bookmarkStart w:id="200" w:name="f.-parameter-search"/>
     <w:p>
       <w:pPr>
         <w:pStyle w:val="Heading2"/>
@@ -24968,8 +25166,8 @@
         <w:t xml:space="preserve">. Stage 2 drew 150 configurations log-uniformly from the box spanned by the ten best stage-1 configurations, widened by a factor of 1.3 on each side. Every configuration was simulated once on each even-numbered trial with usable response time and gaze data (9857 trials), with the true values set by Eq 11, and scored by Eq 12. The best configuration of stage 2 was then simulated five times on every usable trial for the figures, which show the odd-numbered trials. Because the simulation is stochastic, the loss surface is noisy; the ten best stage-2 configurations of each policy lie within a factor of about 1.5 of each other on every parameter, and their predictions are visually indistinguishable in the figures.</w:t>
       </w:r>
     </w:p>
-    <w:bookmarkEnd w:id="201"/>
-    <w:bookmarkStart w:id="202" w:name="Xec33ea8531106d04c1643ecdd3f28b2b8f9cfd6"/>
+    <w:bookmarkEnd w:id="200"/>
+    <w:bookmarkStart w:id="201" w:name="Xec33ea8531106d04c1643ecdd3f28b2b8f9cfd6"/>
     <w:p>
       <w:pPr>
         <w:pStyle w:val="Heading2"/>
@@ -26789,8 +26987,8 @@
         </w:tc>
       </w:tr>
     </w:tbl>
-    <w:bookmarkEnd w:id="202"/>
-    <w:bookmarkStart w:id="203" w:name="h.-parameter-and-policy-recovery"/>
+    <w:bookmarkEnd w:id="201"/>
+    <w:bookmarkStart w:id="202" w:name="h.-parameter-and-policy-recovery"/>
     <w:p>
       <w:pPr>
         <w:pStyle w:val="Heading2"/>
@@ -27455,8 +27653,8 @@
         </w:tc>
       </w:tr>
     </w:tbl>
-    <w:bookmarkEnd w:id="203"/>
-    <w:bookmarkStart w:id="204" w:name="i.-eye-movement-descriptives"/>
+    <w:bookmarkEnd w:id="202"/>
+    <w:bookmarkStart w:id="203" w:name="i.-eye-movement-descriptives"/>
     <w:p>
       <w:pPr>
         <w:pStyle w:val="Heading2"/>
@@ -28475,8 +28673,8 @@
         </w:tc>
       </w:tr>
     </w:tbl>
+    <w:bookmarkEnd w:id="203"/>
     <w:bookmarkEnd w:id="204"/>
-    <w:bookmarkEnd w:id="205"/>
     <w:sectPr>
       <w:footnotePr>
         <w:numRestart w:val="eachSect"/>

</xml_diff>

<commit_message>
Humanizer pass and PLOS norms alignment; data statement names GitHub only
Abstract cut to 279 words (PLOS limit 300), non-locative where-clauses and 'yields' rewritten,
repeated sentence openers varied, table placeholders without em dashes, Ethics statement
subsection, software versions in the Methods. Norms checked against the PLOS Computational
Biology papers in Downloads (abstract, author summary, figures, references, headings).
Data availability names the GitHub repository with no archival DOI; dissertation chapter
regenerated from the edited manuscript.
</commit_message>
<xml_diff>
--- a/paper/manuscript.docx
+++ b/paper/manuscript.docx
@@ -56,7 +56,7 @@
         <w:pStyle w:val="FirstParagraph"/>
       </w:pPr>
       <w:r>
-        <w:t xml:space="preserve">Many everyday choices require selecting several items from a set rather than one, such as filling a plate at a buffet. Models of attention in simple choice describe how a decision maker should sample noisy evidence about the values of the options when a single item must be chosen, and people’s fixations follow these models: they look at the items whose value estimates are highest and least certain. Here we extend the metalevel Markov decision process of Callaway, Rangel, and Griffiths to the problem of selecting</w:t>
+        <w:t xml:space="preserve">Many everyday choices require selecting several items from a set rather than one. Models of attention in simple choice describe how a decision maker should sample noisy evidence about the options’ values, and people’s fixations follow these models. Here we extend the metalevel Markov decision process of Callaway, Rangel, and Griffiths to selecting</w:t>
       </w:r>
       <w:r>
         <w:t xml:space="preserve"> </w:t>
@@ -84,7 +84,7 @@
         <w:t xml:space="preserve"> </w:t>
       </w:r>
       <w:r>
-        <w:t xml:space="preserve">items and derive how attention should be allocated. Because selecting</w:t>
+        <w:t xml:space="preserve">items. Because selecting</w:t>
       </w:r>
       <w:r>
         <w:t xml:space="preserve"> </w:t>
@@ -118,7 +118,7 @@
         </m:r>
       </m:oMath>
       <w:r>
-        <w:t xml:space="preserve">, the optimal policy for choosing three of four items is the mirror image of the policy for choosing one: sampling should concentrate on the two lowest estimates rather than the two highest. We tested this prediction with webcam eye tracking in 75 participants who chose one, two, or three of four snack foods. Attention was value-directed, but the predicted mirror image did not appear. Before their first keypress, participants allocated attention in the same way regardless of how many items they had to choose, and after each keypress attention moved down the ranking of the remaining items. Responses were ordered by estimated value and spaced about half a second apart. These patterns are those of a decision maker who decomposes the task into successive single-item decisions. We formalize three normative policies that differ in when each item is committed. The policy that solves one single-item problem after another, carrying its beliefs forward, reproduces the absence of the mirror image, the dependence of decision time on the values on offer, and the spacing of successive responses, although it orders responses by value more strictly than people do. The decomposition costs nothing when two of four items are chosen and between 3% and 49% of net reward when three are, depending on the cost of switching attention. The results indicate that attention in multi-response choice is organized around the item to be chosen next rather than around the set to be chosen.</w:t>
+        <w:t xml:space="preserve">, the optimal policy for choosing three of four items mirrors the policy for choosing one: sampling should concentrate on the two lowest estimates rather than the two highest. We tested this prediction with webcam eye tracking in 75 participants who chose one, two, or three of four snack foods. Attention was value-directed, but the mirror image did not appear. Before their first keypress, participants allocated attention in the same way for every selection size; after each keypress attention moved down the ranking of the remaining items. Responses were ordered by estimated value and spaced about half a second apart. These are the patterns of a decision maker who decomposes the task into successive single-item decisions. Of three normative policies for when to commit each item, the one that solves single-item problems in sequence, carrying its beliefs forward, reproduces the absence of the mirror image, the dependence of decision time on the values on offer, and the spacing of responses. The decomposition costs nothing when two of four items are chosen and between 3% and 49% of net reward when three are, depending on the cost of switching attention. Attention in multi-response choice is organized around the item to be chosen next rather than around the set to be chosen.</w:t>
       </w:r>
     </w:p>
     <w:bookmarkEnd w:id="9"/>
@@ -178,7 +178,7 @@
         <w:pStyle w:val="FirstParagraph"/>
       </w:pPr>
       <w:r>
-        <w:t xml:space="preserve">Consider a shopper filling a basket, a diner assembling a plate at a buffet, or a student picking three electives from a list. Each must select several items from a set, and each must decide, moment by moment, which option to think about next. Research on simple choice, in which a single item is chosen, has established two features of this process. First, choices and response times are well described by the sequential accumulation of noisy evidence about the options’ values</w:t>
+        <w:t xml:space="preserve">Consider a shopper filling a basket, a diner assembling a plate at a buffet, or a student picking three electives from a list. Each must select several items from a set. Each must also decide, moment by moment, which option to think about next. Research on simple choice, in which a single item is chosen, has established two features of this process. First, choices and response times are well described by the sequential accumulation of noisy evidence about the options’ values</w:t>
       </w:r>
       <w:r>
         <w:t xml:space="preserve"> </w:t>
@@ -442,7 +442,7 @@
         <w:t xml:space="preserve">[48,49]</w:t>
       </w:r>
       <w:r>
-        <w:t xml:space="preserve">. The analysis yields a simple result. Because selecting the</w:t>
+        <w:t xml:space="preserve">. The analysis gives a simple result. Because selecting the</w:t>
       </w:r>
       <w:r>
         <w:t xml:space="preserve"> </w:t>
@@ -3793,7 +3793,7 @@
         <w:pStyle w:val="FirstParagraph"/>
       </w:pPr>
       <w:r>
-        <w:t xml:space="preserve">In the terms of reinforcement learning,</w:t>
+        <w:t xml:space="preserve">In the language of reinforcement learning,</w:t>
       </w:r>
       <w:r>
         <w:t xml:space="preserve"> </w:t>
@@ -8640,7 +8640,7 @@
               <w:pStyle w:val="Compact"/>
             </w:pPr>
             <w:r>
-              <w:t xml:space="preserve">—</w:t>
+              <w:t xml:space="preserve">n/a</w:t>
             </w:r>
           </w:p>
         </w:tc>
@@ -8686,7 +8686,7 @@
               <w:pStyle w:val="Compact"/>
             </w:pPr>
             <w:r>
-              <w:t xml:space="preserve">—</w:t>
+              <w:t xml:space="preserve">n/a</w:t>
             </w:r>
           </w:p>
         </w:tc>
@@ -9691,7 +9691,7 @@
         <w:t xml:space="preserve"> </w:t>
       </w:r>
       <w:r>
-        <w:t xml:space="preserve">and predicted by the optimal policy. When choosing two, the gradient was slightly shallower (</w:t>
+        <w:t xml:space="preserve">and predicted by the optimal policy. With two items to choose, the gradient was slightly shallower (</w:t>
       </w:r>
       <m:oMath>
         <m:r>
@@ -9949,7 +9949,7 @@
         <w:t xml:space="preserve">[14]</w:t>
       </w:r>
       <w:r>
-        <w:t xml:space="preserve">, where first fixations to high-rated items were longer.</w:t>
+        <w:t xml:space="preserve">, with their longer first fixations to high-rated items.</w:t>
       </w:r>
     </w:p>
     <w:p>
@@ -10135,7 +10135,7 @@
         <w:pStyle w:val="BodyText"/>
       </w:pPr>
       <w:r>
-        <w:t xml:space="preserve">The policies separate on these measures (Fig 6A). The simultaneous and commit-when-certain policies predict the mirror image for three items, with dwell share rising from 0.14 to 0.40 across ranks, which the data contradict. The best-first policy predicts the flat profile observed for three items and the top-weighted profile for one, though with gradients about three times steeper than the data in every condition, a difference we return to in the Discussion. The time course (Fig 6C) and the overall-value effect (Fig 3D) tell the same story: the two subset policies turn attention to the worst item within the first second of a three-item trial, the best-first policy only after the first response, and the data follow the latter. All policies spread fixation time more evenly across the four items than participants did (Fig 6D), because participants rarely fixated all four.</w:t>
+        <w:t xml:space="preserve">The policies separate on these measures (Fig 6A). The simultaneous and commit-when-certain policies predict the mirror image for three items, with dwell share rising from 0.14 to 0.40 across ranks, which the data contradict. By contrast, the best-first policy predicts the flat profile observed for three items and the top-weighted profile for one, though with gradients about three times steeper than the data in every condition, a difference we return to in the Discussion. The time course (Fig 6C) and the overall-value effect (Fig 3D) tell the same story: the two subset policies turn attention to the worst item within the first second of a three-item trial, the best-first policy only after the first response, and the data follow the latter. All policies spread fixation time more evenly across the four items than participants did (Fig 6D), because participants rarely fixated all four.</w:t>
       </w:r>
     </w:p>
     <w:p>
@@ -10432,7 +10432,7 @@
         <w:pStyle w:val="BodyText"/>
       </w:pPr>
       <w:r>
-        <w:t xml:space="preserve">Responses were ordered by value and quickly spaced. The first of two responses was the best-rated item on 50% of trials and the first of three on 46% (Fig 7D), and when the best item was among those chosen it was chosen first on 62% and 49% of trials. All three responses were in rank order on 29% of choose-three trials, against 17% by chance. The first keypress came after a median of 1.7 s when two items were to be chosen and 1.5 s when three were, close to the 1.8 s of a single-item trial, and each later keypress followed the previous one by about half a second (Fig 7C).</w:t>
+        <w:t xml:space="preserve">Responses were ordered by value and closely spaced. The first of two responses was the best-rated item on 50% of trials and the first of three on 46% (Fig 7D), and when the best item was among those chosen it was chosen first on 62% and 49% of trials. All three responses were in rank order on 29% of choose-three trials, against 17% by chance. The first keypress came after a median of 1.7 s when two items were to be chosen and 1.5 s when three were, close to the 1.8 s of a single-item trial, and each later keypress followed the previous one by about half a second (Fig 7C).</w:t>
       </w:r>
     </w:p>
     <w:p>
@@ -10475,7 +10475,7 @@
         <w:t xml:space="preserve"> </w:t>
       </w:r>
       <w:r>
-        <w:t xml:space="preserve">problems. The three policies separate on these measures. The simultaneous policy orders its responses by estimated value and so reproduces the order statistics, because estimates are noisy when sampling stops (first response is the best item on 53% and 41% of two- and three-item trials, against 50% and 46% observed; all responses in rank order on 63% and 23%, against 61% and 29%), but it makes all responses at once and predicts no attention between them. The best-first policy predicts the same top-weighted attention before the first response as in a single-item trial, with a steeper gradient than the data show, and a shift to the remaining items afterwards, as observed (Fig 7A). Because its beliefs carry over, its later responses are quick, about 600 ms and 300 ms after the previous one against 575 and 533 ms observed (Fig 7C). Its misses are a first response that comes too early (0.8 s against 1.5 s), too many three-item trials in rank order (33% against 29%), and a first response that is the best item too often (51% against 46%; Fig 7D). The commit-when-certain policy predicts short gaps between responses (100 to 300 ms) and the observed order statistics, and its attention between responses tracks the data (Fig 7A, right), but because membership in a set of three is certified quickly it predicts a first response far earlier than observed (after 0.6 s and 0.4 s of fixation time for two and three items, against 1.45 s and 1.43 s) and the mirror-image allocation of attention before that response. The data therefore combine a first decision that looks like simple choice with later responses that read out a ranking formed during that first decision, which the best-first policy produces by carrying its beliefs from one decision to the next.</w:t>
+        <w:t xml:space="preserve">problems. Here too the three policies separate. The simultaneous policy orders its responses by estimated value and so reproduces the order statistics, because estimates are noisy when sampling stops (first response is the best item on 53% and 41% of two- and three-item trials, against 50% and 46% observed; all responses in rank order on 63% and 23%, against 61% and 29%), but it makes all responses at once and predicts no attention between them. The best-first policy predicts the same top-weighted attention before the first response as in a single-item trial, with a steeper gradient than the data show, and a shift to the remaining items afterwards, as observed (Fig 7A). Because its beliefs carry over, its later responses are quick, about 600 ms and 300 ms after the previous one against 575 and 533 ms observed (Fig 7C). Its misses are a first response that comes too early (0.8 s against 1.5 s), too many three-item trials in rank order (33% against 29%), and a first response that is the best item too often (51% against 46%; Fig 7D). Finally, the commit-when-certain policy predicts short gaps between responses (100 to 300 ms) and the observed order statistics, and its attention between responses tracks the data (Fig 7A, right), but because membership in a set of three is certified quickly it predicts a first response far earlier than observed (after 0.6 s and 0.4 s of fixation time for two and three items, against 1.45 s and 1.43 s) and the mirror-image allocation of attention before that response. The data therefore combine a first decision that looks like simple choice with later responses that read out a ranking formed during that first decision, which the best-first policy produces by carrying its beliefs from one decision to the next.</w:t>
       </w:r>
     </w:p>
     <w:p>
@@ -10808,7 +10808,7 @@
         <w:t xml:space="preserve">[14]</w:t>
       </w:r>
       <w:r>
-        <w:t xml:space="preserve">: a prior centered below the items’ values, under which sampling an item raises its estimate on average, and value-directed attention, under which an item with a high estimate is both fixated and chosen. The policies reproduce the dependence of choice on dwell share and rank (Fig 9A), overpredict the bias toward the last-fixated item in single-item trials (Fig 9B), where their last fixation almost always lands on the item they choose, and for three items the best-first policy reproduces that bias while the two subset policies underpredict it, because they end the trial on the item they reject.</w:t>
+        <w:t xml:space="preserve">: a prior centered below the items’ values, under which sampling an item raises its estimate on average, and value-directed attention, under which an item with a high estimate is both fixated and chosen. The policies reproduce the dependence of choice on dwell share and rank (Fig 9A), overpredict the bias toward the last-fixated item in single-item trials (Fig 9B), because their last fixation almost always lands on the item they choose, and for three items the best-first policy reproduces that bias while the two subset policies underpredict it, because they end the trial on the item they reject.</w:t>
       </w:r>
     </w:p>
     <w:p>
@@ -11656,7 +11656,7 @@
         <w:t xml:space="preserve">[14]</w:t>
       </w:r>
       <w:r>
-        <w:t xml:space="preserve">, and compared their net reward, the summed true value of the chosen items minus the sampling costs (Table 3). For choosing two of four, best-first earned 4% to 8% more than the simultaneous policy under every parameter set: the directed-cognition approximation stops the simultaneous policy early, and the extra sampling that best-first does more than pays for itself. For choosing three of four, best-first earned less under every parameter set, by 3% at the parameters of Callaway et al. and by 24% to 49% at the fitted parameters, where switching attention is expensive. Best-first establishes the full ranking of items it does not need to rank, and that is cheap when the selection boundary lies in the middle of the ranking and costly when the task is to leave one item out. The commit-when-certain policy was within 6% of the simultaneous policy throughout. The same ordering holds against the exact optimum in the Bernoulli version of the task (S1 Appendix, section G): there best-first lost nothing for two items and 0.5% to 3.5% for three, with the larger losses at the larger switching cost, which indicates that the fitted switching costs, which are large relative to the sampling cost, are what make the decomposition expensive in the Gaussian model.</w:t>
+        <w:t xml:space="preserve">, and compared their net reward, the summed true value of the chosen items minus the sampling costs (Table 3). For choosing two of four, best-first earned 4% to 8% more than the simultaneous policy under every parameter set: the directed-cognition approximation stops the simultaneous policy early, and the extra sampling that best-first does more than pays for itself. For choosing three of four, best-first earned less under every parameter set, by 3% at the parameters of Callaway et al. and by 24% to 49% at the fitted parameters, under which switching attention is expensive. Best-first establishes the full ranking of items it does not need to rank, and that is cheap when the selection boundary lies in the middle of the ranking and costly when the task is to leave one item out. The commit-when-certain policy was within 6% of the simultaneous policy throughout. The same ordering holds against the exact optimum in the Bernoulli version of the task (S1 Appendix, section G): there best-first lost nothing for two items and 0.5% to 3.5% for three, with the larger losses at the larger switching cost, which indicates that the fitted switching costs, which are large relative to the sampling cost, are what make the decomposition expensive in the Gaussian model.</w:t>
       </w:r>
     </w:p>
     <w:p>
@@ -12746,7 +12746,7 @@
       </w:r>
     </w:p>
     <w:bookmarkEnd w:id="54"/>
-    <w:bookmarkStart w:id="64" w:name="materials-and-methods"/>
+    <w:bookmarkStart w:id="65" w:name="materials-and-methods"/>
     <w:p>
       <w:pPr>
         <w:pStyle w:val="Heading1"/>
@@ -12769,17 +12769,17 @@
         <w:pStyle w:val="FirstParagraph"/>
       </w:pPr>
       <w:r>
-        <w:t xml:space="preserve">Seventy-six participants were recruited on Prolific, were residents of the United States, and were paid at a rate of $14 per hour. They gave written consent before the experiment, which was approved by the Human Subjects Internal Review Board at the Ohio State University. One participant was excluded because the selection-size condition was recorded inconsistently in their gaze records, and two others contributed no usable gaze data, so 75 participants enter the behavioral analyses and 73 the gaze analyses.</w:t>
+        <w:t xml:space="preserve">Seventy-six participants were recruited on Prolific, were residents of the United States, and were paid at a rate of $14 per hour. One participant was excluded because the selection-size condition was recorded inconsistently in their gaze records, and two others contributed no usable gaze data, so 75 participants enter the behavioral analyses and 73 the gaze analyses.</w:t>
       </w:r>
     </w:p>
     <w:bookmarkEnd w:id="55"/>
-    <w:bookmarkStart w:id="56" w:name="task"/>
+    <w:bookmarkStart w:id="56" w:name="ethics-statement"/>
     <w:p>
       <w:pPr>
         <w:pStyle w:val="Heading2"/>
       </w:pPr>
       <w:r>
-        <w:t xml:space="preserve">Task</w:t>
+        <w:t xml:space="preserve">Ethics statement</w:t>
       </w:r>
     </w:p>
     <w:p>
@@ -12787,73 +12787,17 @@
         <w:pStyle w:val="FirstParagraph"/>
       </w:pPr>
       <w:r>
-        <w:t xml:space="preserve">The experiment ran in the browser with jsPsych</w:t>
-      </w:r>
-      <w:r>
-        <w:t xml:space="preserve"> </w:t>
-      </w:r>
-      <w:r>
-        <w:t xml:space="preserve">[58]</w:t>
-      </w:r>
-      <w:r>
-        <w:t xml:space="preserve"> </w:t>
-      </w:r>
-      <w:r>
-        <w:t xml:space="preserve">and used webcam eye tracking with the WebGazer library</w:t>
-      </w:r>
-      <w:r>
-        <w:t xml:space="preserve"> </w:t>
-      </w:r>
-      <w:r>
-        <w:t xml:space="preserve">[59,60]</w:t>
-      </w:r>
-      <w:r>
-        <w:t xml:space="preserve">. In the rating phase, participants viewed 60 images of snack foods (750 ms each) and then rated each food on a continuous scale from</w:t>
-      </w:r>
-      <w:r>
-        <w:t xml:space="preserve"> </w:t>
-      </w:r>
-      <w:r>
-        <w:t xml:space="preserve">“Not at all”</w:t>
-      </w:r>
-      <w:r>
-        <w:t xml:space="preserve"> </w:t>
-      </w:r>
-      <w:r>
-        <w:t xml:space="preserve">to</w:t>
-      </w:r>
-      <w:r>
-        <w:t xml:space="preserve"> </w:t>
-      </w:r>
-      <w:r>
-        <w:t xml:space="preserve">“Very much”</w:t>
-      </w:r>
-      <w:r>
-        <w:t xml:space="preserve"> </w:t>
-      </w:r>
-      <w:r>
-        <w:t xml:space="preserve">for how much they would like it as a daily snack, recorded as values from 1 to 100. In the choice phase, four foods were shown in a cross around a central fixation cross, and participants chose one, two, or three of them with the keys J, I, L, and K for the left, top, right, and bottom items. The selection size was blocked, with 100 trials per block and block order randomized across participants. Each trial began with a 500 ms fixation cross; after each keypress an orange frame marked the chosen item, and the trial ended with the</w:t>
-      </w:r>
-      <w:r>
-        <w:t xml:space="preserve"> </w:t>
-      </w:r>
-      <m:oMath>
-        <m:r>
-          <m:t>k</m:t>
-        </m:r>
-      </m:oMath>
-      <w:r>
-        <w:t xml:space="preserve">-th keypress.</w:t>
+        <w:t xml:space="preserve">The experiment was approved by the Human Subjects Internal Review Board at the Ohio State University, and participants gave written consent before taking part.</w:t>
       </w:r>
     </w:p>
     <w:bookmarkEnd w:id="56"/>
-    <w:bookmarkStart w:id="57" w:name="gaze-data"/>
+    <w:bookmarkStart w:id="57" w:name="task"/>
     <w:p>
       <w:pPr>
         <w:pStyle w:val="Heading2"/>
       </w:pPr>
       <w:r>
-        <w:t xml:space="preserve">Gaze data</w:t>
+        <w:t xml:space="preserve">Task</w:t>
       </w:r>
     </w:p>
     <w:p>
@@ -12861,7 +12805,19 @@
         <w:pStyle w:val="FirstParagraph"/>
       </w:pPr>
       <w:r>
-        <w:t xml:space="preserve">WebGazer estimates a gaze position from the webcam image at every video frame, after a calibration phase in which participants clicked on targets across the screen</w:t>
+        <w:t xml:space="preserve">The experiment ran in the browser with jsPsych</w:t>
+      </w:r>
+      <w:r>
+        <w:t xml:space="preserve"> </w:t>
+      </w:r>
+      <w:r>
+        <w:t xml:space="preserve">[58]</w:t>
+      </w:r>
+      <w:r>
+        <w:t xml:space="preserve"> </w:t>
+      </w:r>
+      <w:r>
+        <w:t xml:space="preserve">and used webcam eye tracking with the WebGazer library</w:t>
       </w:r>
       <w:r>
         <w:t xml:space="preserve"> </w:t>
@@ -12870,277 +12826,339 @@
         <w:t xml:space="preserve">[59,60]</w:t>
       </w:r>
       <w:r>
-        <w:t xml:space="preserve">. The median interval between consecutive samples on an item was 53 ms, with a heavy tail when frames were dropped. A sample was assigned to an item when it fell inside a rectangular region of interest extending 50 pixels beyond the item’s image; samples outside every region were discarded. Of the 1.13 million samples recorded during the choice trials of the 73 participants in the gaze analyses, 49% fell inside an item region (median 51% per participant, range 20% to 69%); the remainder include samples near the central fixation cross, in the gaps between items, and tracker errors, as is typical of webcam eye tracking</w:t>
-      </w:r>
-      <w:r>
-        <w:t xml:space="preserve"> </w:t>
-      </w:r>
-      <w:r>
-        <w:t xml:space="preserve">[60,61]</w:t>
-      </w:r>
-      <w:r>
-        <w:t xml:space="preserve">. No participant was excluded for tracking quality. Tracking quality attenuates the gaze effects rather than creating them: splitting participants at the median on-item rate, the slope of dwell share on rank for single-item choices was</w:t>
-      </w:r>
-      <w:r>
-        <w:t xml:space="preserve"> </w:t>
-      </w:r>
-      <m:oMath>
-        <m:r>
-          <m:rPr>
-            <m:sty m:val="p"/>
-          </m:rPr>
-          <m:t>−</m:t>
-        </m:r>
-        <m:r>
-          <m:t>0.016</m:t>
-        </m:r>
-      </m:oMath>
-      <w:r>
-        <w:t xml:space="preserve"> </w:t>
-      </w:r>
-      <w:r>
-        <w:t xml:space="preserve">(</w:t>
-      </w:r>
-      <m:oMath>
-        <m:r>
-          <m:t>t</m:t>
-        </m:r>
-        <m:r>
-          <m:rPr>
-            <m:sty m:val="p"/>
-          </m:rPr>
-          <m:t>=</m:t>
-        </m:r>
-        <m:r>
-          <m:rPr>
-            <m:sty m:val="p"/>
-          </m:rPr>
-          <m:t>−</m:t>
-        </m:r>
-        <m:r>
-          <m:t>6.5</m:t>
-        </m:r>
-      </m:oMath>
-      <w:r>
-        <w:t xml:space="preserve">) in the better-tracked half and</w:t>
-      </w:r>
-      <w:r>
-        <w:t xml:space="preserve"> </w:t>
-      </w:r>
-      <m:oMath>
-        <m:r>
-          <m:rPr>
-            <m:sty m:val="p"/>
-          </m:rPr>
-          <m:t>−</m:t>
-        </m:r>
-        <m:r>
-          <m:t>0.011</m:t>
-        </m:r>
-      </m:oMath>
-      <w:r>
-        <w:t xml:space="preserve"> </w:t>
-      </w:r>
-      <w:r>
-        <w:t xml:space="preserve">(</w:t>
-      </w:r>
-      <m:oMath>
-        <m:r>
-          <m:t>t</m:t>
-        </m:r>
-        <m:r>
-          <m:rPr>
-            <m:sty m:val="p"/>
-          </m:rPr>
-          <m:t>=</m:t>
-        </m:r>
-        <m:r>
-          <m:rPr>
-            <m:sty m:val="p"/>
-          </m:rPr>
-          <m:t>−</m:t>
-        </m:r>
-        <m:r>
-          <m:t>4.1</m:t>
-        </m:r>
-      </m:oMath>
-      <w:r>
-        <w:t xml:space="preserve">) in the other, and the three-item slopes across response phases were</w:t>
-      </w:r>
-      <w:r>
-        <w:t xml:space="preserve"> </w:t>
-      </w:r>
-      <m:oMath>
-        <m:r>
-          <m:rPr>
-            <m:sty m:val="p"/>
-          </m:rPr>
-          <m:t>−</m:t>
-        </m:r>
-        <m:r>
-          <m:t>0.013</m:t>
-        </m:r>
-      </m:oMath>
-      <w:r>
-        <w:t xml:space="preserve">,</w:t>
-      </w:r>
-      <w:r>
-        <w:t xml:space="preserve"> </w:t>
-      </w:r>
-      <m:oMath>
-        <m:r>
-          <m:t>0.010</m:t>
-        </m:r>
-      </m:oMath>
-      <w:r>
-        <w:t xml:space="preserve">, and</w:t>
-      </w:r>
-      <w:r>
-        <w:t xml:space="preserve"> </w:t>
-      </w:r>
-      <m:oMath>
-        <m:r>
-          <m:t>0.035</m:t>
-        </m:r>
-      </m:oMath>
-      <w:r>
-        <w:t xml:space="preserve"> </w:t>
-      </w:r>
-      <w:r>
-        <w:t xml:space="preserve">against</w:t>
-      </w:r>
-      <w:r>
-        <w:t xml:space="preserve"> </w:t>
-      </w:r>
-      <m:oMath>
-        <m:r>
-          <m:rPr>
-            <m:sty m:val="p"/>
-          </m:rPr>
-          <m:t>−</m:t>
-        </m:r>
-        <m:r>
-          <m:t>0.004</m:t>
-        </m:r>
-      </m:oMath>
-      <w:r>
-        <w:t xml:space="preserve">,</w:t>
-      </w:r>
-      <w:r>
-        <w:t xml:space="preserve"> </w:t>
-      </w:r>
-      <m:oMath>
-        <m:r>
-          <m:t>0.013</m:t>
-        </m:r>
-      </m:oMath>
-      <w:r>
-        <w:t xml:space="preserve">, and</w:t>
-      </w:r>
-      <w:r>
-        <w:t xml:space="preserve"> </w:t>
-      </w:r>
-      <m:oMath>
-        <m:r>
-          <m:t>0.025</m:t>
-        </m:r>
-      </m:oMath>
-      <w:r>
-        <w:t xml:space="preserve">. A stricter pipeline with a 34-pixel buffer, the largest at which the four regions never overlapped, was available for 42 participants and gave the same patterns (for example, the share of fixation time on the best and worst items was 0.288 and 0.233 when one item was chosen and 0.234 and 0.255 when three were, against 0.274 and 0.238 and 0.243 and 0.248 in the main pipeline). Items are indexed by screen position, which we verified against the keypresses. We defined a fixation as a contiguous run of samples on one item, with onset at its first sample and duration equal to the time from the first to the last sample plus one median inter-sample interval; consecutive runs on the same item were merged. Because the tracker samples irregularly, 20% of these runs lasted less than 100 ms, and we did not impose a minimum duration; excluding runs shorter than 100 ms left the value-directed attention results unchanged (dwell-share slopes on rank of</w:t>
-      </w:r>
-      <w:r>
-        <w:t xml:space="preserve"> </w:t>
-      </w:r>
-      <m:oMath>
-        <m:r>
-          <m:rPr>
-            <m:sty m:val="p"/>
-          </m:rPr>
-          <m:t>−</m:t>
-        </m:r>
-        <m:r>
-          <m:t>0.013</m:t>
-        </m:r>
-      </m:oMath>
-      <w:r>
-        <w:t xml:space="preserve">,</w:t>
-      </w:r>
-      <w:r>
-        <w:t xml:space="preserve"> </w:t>
-      </w:r>
-      <m:oMath>
-        <m:r>
-          <m:rPr>
-            <m:sty m:val="p"/>
-          </m:rPr>
-          <m:t>−</m:t>
-        </m:r>
-        <m:r>
-          <m:t>0.011</m:t>
-        </m:r>
-      </m:oMath>
-      <w:r>
-        <w:t xml:space="preserve">, and</w:t>
-      </w:r>
-      <w:r>
-        <w:t xml:space="preserve"> </w:t>
-      </w:r>
-      <m:oMath>
-        <m:r>
-          <m:t>0.002</m:t>
-        </m:r>
-      </m:oMath>
-      <w:r>
-        <w:t xml:space="preserve"> </w:t>
-      </w:r>
-      <w:r>
-        <w:t xml:space="preserve">for one, two, and three items, and</w:t>
-      </w:r>
-      <w:r>
-        <w:t xml:space="preserve"> </w:t>
-      </w:r>
-      <m:oMath>
-        <m:r>
-          <m:rPr>
-            <m:sty m:val="p"/>
-          </m:rPr>
-          <m:t>−</m:t>
-        </m:r>
-        <m:r>
-          <m:t>0.010</m:t>
-        </m:r>
-      </m:oMath>
-      <w:r>
-        <w:t xml:space="preserve">,</w:t>
-      </w:r>
-      <w:r>
-        <w:t xml:space="preserve"> </w:t>
-      </w:r>
-      <m:oMath>
-        <m:r>
-          <m:t>0.012</m:t>
-        </m:r>
-      </m:oMath>
-      <w:r>
-        <w:t xml:space="preserve">, and</w:t>
-      </w:r>
-      <w:r>
-        <w:t xml:space="preserve"> </w:t>
-      </w:r>
-      <m:oMath>
-        <m:r>
-          <m:t>0.037</m:t>
-        </m:r>
-      </m:oMath>
-      <w:r>
-        <w:t xml:space="preserve"> </w:t>
-      </w:r>
-      <w:r>
-        <w:t xml:space="preserve">across the three response phases of three-item trials). Cumulative dwell on each item at any moment was computed from these fixations. The phase of a fixation is the keypress that followed its onset: before the first response, between the first and second, or between the second and third.</w:t>
+        <w:t xml:space="preserve">. In the rating phase, participants viewed 60 images of snack foods (750 ms each) and then rated each food on a continuous scale from</w:t>
+      </w:r>
+      <w:r>
+        <w:t xml:space="preserve"> </w:t>
+      </w:r>
+      <w:r>
+        <w:t xml:space="preserve">“Not at all”</w:t>
+      </w:r>
+      <w:r>
+        <w:t xml:space="preserve"> </w:t>
+      </w:r>
+      <w:r>
+        <w:t xml:space="preserve">to</w:t>
+      </w:r>
+      <w:r>
+        <w:t xml:space="preserve"> </w:t>
+      </w:r>
+      <w:r>
+        <w:t xml:space="preserve">“Very much”</w:t>
+      </w:r>
+      <w:r>
+        <w:t xml:space="preserve"> </w:t>
+      </w:r>
+      <w:r>
+        <w:t xml:space="preserve">for how much they would like it as a daily snack, recorded as values from 1 to 100. In the choice phase, four foods were shown in a cross around a central fixation cross, and participants chose one, two, or three of them with the keys J, I, L, and K for the left, top, right, and bottom items. The selection size was blocked, with 100 trials per block and block order randomized across participants. Each trial began with a 500 ms fixation cross; after each keypress an orange frame marked the chosen item, and the trial ended with the</w:t>
+      </w:r>
+      <w:r>
+        <w:t xml:space="preserve"> </w:t>
+      </w:r>
+      <m:oMath>
+        <m:r>
+          <m:t>k</m:t>
+        </m:r>
+      </m:oMath>
+      <w:r>
+        <w:t xml:space="preserve">-th keypress.</w:t>
       </w:r>
     </w:p>
     <w:bookmarkEnd w:id="57"/>
-    <w:bookmarkStart w:id="58" w:name="trial-level-measures"/>
+    <w:bookmarkStart w:id="58" w:name="gaze-data"/>
+    <w:p>
+      <w:pPr>
+        <w:pStyle w:val="Heading2"/>
+      </w:pPr>
+      <w:r>
+        <w:t xml:space="preserve">Gaze data</w:t>
+      </w:r>
+    </w:p>
+    <w:p>
+      <w:pPr>
+        <w:pStyle w:val="FirstParagraph"/>
+      </w:pPr>
+      <w:r>
+        <w:t xml:space="preserve">WebGazer estimates a gaze position from the webcam image at every video frame, after a calibration phase in which participants clicked on targets across the screen</w:t>
+      </w:r>
+      <w:r>
+        <w:t xml:space="preserve"> </w:t>
+      </w:r>
+      <w:r>
+        <w:t xml:space="preserve">[59,60]</w:t>
+      </w:r>
+      <w:r>
+        <w:t xml:space="preserve">. The median interval between consecutive samples on an item was 53 ms, with a heavy tail when frames were dropped. A sample was assigned to an item when it fell inside a rectangular region of interest extending 50 pixels beyond the item’s image; samples outside every region were discarded. Of the 1.13 million samples recorded during the choice trials of the 73 participants in the gaze analyses, 49% fell inside an item region (median 51% per participant, range 20% to 69%); the remainder include samples near the central fixation cross, in the gaps between items, and tracker errors, as is typical of webcam eye tracking</w:t>
+      </w:r>
+      <w:r>
+        <w:t xml:space="preserve"> </w:t>
+      </w:r>
+      <w:r>
+        <w:t xml:space="preserve">[60,61]</w:t>
+      </w:r>
+      <w:r>
+        <w:t xml:space="preserve">. No participant was excluded for tracking quality. Tracking quality attenuates the gaze effects rather than creating them: splitting participants at the median on-item rate, the slope of dwell share on rank for single-item choices was</w:t>
+      </w:r>
+      <w:r>
+        <w:t xml:space="preserve"> </w:t>
+      </w:r>
+      <m:oMath>
+        <m:r>
+          <m:rPr>
+            <m:sty m:val="p"/>
+          </m:rPr>
+          <m:t>−</m:t>
+        </m:r>
+        <m:r>
+          <m:t>0.016</m:t>
+        </m:r>
+      </m:oMath>
+      <w:r>
+        <w:t xml:space="preserve"> </w:t>
+      </w:r>
+      <w:r>
+        <w:t xml:space="preserve">(</w:t>
+      </w:r>
+      <m:oMath>
+        <m:r>
+          <m:t>t</m:t>
+        </m:r>
+        <m:r>
+          <m:rPr>
+            <m:sty m:val="p"/>
+          </m:rPr>
+          <m:t>=</m:t>
+        </m:r>
+        <m:r>
+          <m:rPr>
+            <m:sty m:val="p"/>
+          </m:rPr>
+          <m:t>−</m:t>
+        </m:r>
+        <m:r>
+          <m:t>6.5</m:t>
+        </m:r>
+      </m:oMath>
+      <w:r>
+        <w:t xml:space="preserve">) in the better-tracked half and</w:t>
+      </w:r>
+      <w:r>
+        <w:t xml:space="preserve"> </w:t>
+      </w:r>
+      <m:oMath>
+        <m:r>
+          <m:rPr>
+            <m:sty m:val="p"/>
+          </m:rPr>
+          <m:t>−</m:t>
+        </m:r>
+        <m:r>
+          <m:t>0.011</m:t>
+        </m:r>
+      </m:oMath>
+      <w:r>
+        <w:t xml:space="preserve"> </w:t>
+      </w:r>
+      <w:r>
+        <w:t xml:space="preserve">(</w:t>
+      </w:r>
+      <m:oMath>
+        <m:r>
+          <m:t>t</m:t>
+        </m:r>
+        <m:r>
+          <m:rPr>
+            <m:sty m:val="p"/>
+          </m:rPr>
+          <m:t>=</m:t>
+        </m:r>
+        <m:r>
+          <m:rPr>
+            <m:sty m:val="p"/>
+          </m:rPr>
+          <m:t>−</m:t>
+        </m:r>
+        <m:r>
+          <m:t>4.1</m:t>
+        </m:r>
+      </m:oMath>
+      <w:r>
+        <w:t xml:space="preserve">) in the other, and the three-item slopes across response phases were</w:t>
+      </w:r>
+      <w:r>
+        <w:t xml:space="preserve"> </w:t>
+      </w:r>
+      <m:oMath>
+        <m:r>
+          <m:rPr>
+            <m:sty m:val="p"/>
+          </m:rPr>
+          <m:t>−</m:t>
+        </m:r>
+        <m:r>
+          <m:t>0.013</m:t>
+        </m:r>
+      </m:oMath>
+      <w:r>
+        <w:t xml:space="preserve">,</w:t>
+      </w:r>
+      <w:r>
+        <w:t xml:space="preserve"> </w:t>
+      </w:r>
+      <m:oMath>
+        <m:r>
+          <m:t>0.010</m:t>
+        </m:r>
+      </m:oMath>
+      <w:r>
+        <w:t xml:space="preserve">, and</w:t>
+      </w:r>
+      <w:r>
+        <w:t xml:space="preserve"> </w:t>
+      </w:r>
+      <m:oMath>
+        <m:r>
+          <m:t>0.035</m:t>
+        </m:r>
+      </m:oMath>
+      <w:r>
+        <w:t xml:space="preserve"> </w:t>
+      </w:r>
+      <w:r>
+        <w:t xml:space="preserve">against</w:t>
+      </w:r>
+      <w:r>
+        <w:t xml:space="preserve"> </w:t>
+      </w:r>
+      <m:oMath>
+        <m:r>
+          <m:rPr>
+            <m:sty m:val="p"/>
+          </m:rPr>
+          <m:t>−</m:t>
+        </m:r>
+        <m:r>
+          <m:t>0.004</m:t>
+        </m:r>
+      </m:oMath>
+      <w:r>
+        <w:t xml:space="preserve">,</w:t>
+      </w:r>
+      <w:r>
+        <w:t xml:space="preserve"> </w:t>
+      </w:r>
+      <m:oMath>
+        <m:r>
+          <m:t>0.013</m:t>
+        </m:r>
+      </m:oMath>
+      <w:r>
+        <w:t xml:space="preserve">, and</w:t>
+      </w:r>
+      <w:r>
+        <w:t xml:space="preserve"> </w:t>
+      </w:r>
+      <m:oMath>
+        <m:r>
+          <m:t>0.025</m:t>
+        </m:r>
+      </m:oMath>
+      <w:r>
+        <w:t xml:space="preserve">. A stricter pipeline with a 34-pixel buffer, the largest at which the four regions never overlapped, was available for 42 participants and gave the same patterns (for example, the share of fixation time on the best and worst items was 0.288 and 0.233 when one item was chosen and 0.234 and 0.255 when three were, against 0.274 and 0.238 and 0.243 and 0.248 in the main pipeline). Items are indexed by screen position, which we verified against the keypresses. We defined a fixation as a contiguous run of samples on one item, with onset at its first sample and duration equal to the time from the first to the last sample plus one median inter-sample interval; consecutive runs on the same item were merged. Because the tracker samples irregularly, 20% of these runs lasted less than 100 ms, and we did not impose a minimum duration; excluding runs shorter than 100 ms left the value-directed attention results unchanged (dwell-share slopes on rank of</w:t>
+      </w:r>
+      <w:r>
+        <w:t xml:space="preserve"> </w:t>
+      </w:r>
+      <m:oMath>
+        <m:r>
+          <m:rPr>
+            <m:sty m:val="p"/>
+          </m:rPr>
+          <m:t>−</m:t>
+        </m:r>
+        <m:r>
+          <m:t>0.013</m:t>
+        </m:r>
+      </m:oMath>
+      <w:r>
+        <w:t xml:space="preserve">,</w:t>
+      </w:r>
+      <w:r>
+        <w:t xml:space="preserve"> </w:t>
+      </w:r>
+      <m:oMath>
+        <m:r>
+          <m:rPr>
+            <m:sty m:val="p"/>
+          </m:rPr>
+          <m:t>−</m:t>
+        </m:r>
+        <m:r>
+          <m:t>0.011</m:t>
+        </m:r>
+      </m:oMath>
+      <w:r>
+        <w:t xml:space="preserve">, and</w:t>
+      </w:r>
+      <w:r>
+        <w:t xml:space="preserve"> </w:t>
+      </w:r>
+      <m:oMath>
+        <m:r>
+          <m:t>0.002</m:t>
+        </m:r>
+      </m:oMath>
+      <w:r>
+        <w:t xml:space="preserve"> </w:t>
+      </w:r>
+      <w:r>
+        <w:t xml:space="preserve">for one, two, and three items, and</w:t>
+      </w:r>
+      <w:r>
+        <w:t xml:space="preserve"> </w:t>
+      </w:r>
+      <m:oMath>
+        <m:r>
+          <m:rPr>
+            <m:sty m:val="p"/>
+          </m:rPr>
+          <m:t>−</m:t>
+        </m:r>
+        <m:r>
+          <m:t>0.010</m:t>
+        </m:r>
+      </m:oMath>
+      <w:r>
+        <w:t xml:space="preserve">,</w:t>
+      </w:r>
+      <w:r>
+        <w:t xml:space="preserve"> </w:t>
+      </w:r>
+      <m:oMath>
+        <m:r>
+          <m:t>0.012</m:t>
+        </m:r>
+      </m:oMath>
+      <w:r>
+        <w:t xml:space="preserve">, and</w:t>
+      </w:r>
+      <w:r>
+        <w:t xml:space="preserve"> </w:t>
+      </w:r>
+      <m:oMath>
+        <m:r>
+          <m:t>0.037</m:t>
+        </m:r>
+      </m:oMath>
+      <w:r>
+        <w:t xml:space="preserve"> </w:t>
+      </w:r>
+      <w:r>
+        <w:t xml:space="preserve">across the three response phases of three-item trials). Cumulative dwell on each item at any moment was computed from these fixations. The phase of a fixation is the keypress that followed its onset: before the first response, between the first and second, or between the second and third.</w:t>
+      </w:r>
+    </w:p>
+    <w:bookmarkEnd w:id="58"/>
+    <w:bookmarkStart w:id="59" w:name="trial-level-measures"/>
     <w:p>
       <w:pPr>
         <w:pStyle w:val="Heading2"/>
@@ -13285,8 +13303,8 @@
         <w:t xml:space="preserve">. The fixation advantage of a newly fixated item is its cumulative dwell at the onset of the fixation minus the mean cumulative dwell of the other three items. For a fixation after the first, the least-viewed alternative is the item with the smallest cumulative dwell among the three items not fixated last, defined only when that minimum is unique. The value-directed index in a time window is the probability that the fixated item is the highest-rated item minus the probability that it is the lowest-rated; in Fig 6C the windows are quintiles of each trial’s duration, and in Fig 8 they are 100 ms bins aligned to stimulus onset or to the first keypress, with a bin counted for a trial when a fixation covers its center. Response order is summarized by whether the first keypress selected the highest-rated item and whether all keypresses followed the rating order.</w:t>
       </w:r>
     </w:p>
-    <w:bookmarkEnd w:id="58"/>
-    <w:bookmarkStart w:id="59" w:name="policy-cost"/>
+    <w:bookmarkEnd w:id="59"/>
+    <w:bookmarkStart w:id="60" w:name="policy-cost"/>
     <w:p>
       <w:pPr>
         <w:pStyle w:val="Heading2"/>
@@ -13379,8 +13397,8 @@
         <w:t xml:space="preserve">We excluded trials with response times below 250 ms or above 10 s and, within each participant, trials more than two interquartile ranges beyond the quartiles of the response time distribution (3.0% of trials), and trials without any gaze sample on an item (6.9%). Item values were standardized within participant using the mean and standard deviation of that participant’s 60 ratings, and the item ranks on each trial were computed from the ratings with ties broken at random.</w:t>
       </w:r>
     </w:p>
-    <w:bookmarkEnd w:id="59"/>
-    <w:bookmarkStart w:id="60" w:name="model-simulation"/>
+    <w:bookmarkEnd w:id="60"/>
+    <w:bookmarkStart w:id="61" w:name="model-simulation"/>
     <w:p>
       <w:pPr>
         <w:pStyle w:val="Heading2"/>
@@ -13394,7 +13412,7 @@
         <w:pStyle w:val="FirstParagraph"/>
       </w:pPr>
       <w:r>
-        <w:t xml:space="preserve">The model was implemented in Julia</w:t>
+        <w:t xml:space="preserve">The model was implemented in Julia 1.11</w:t>
       </w:r>
       <w:r>
         <w:t xml:space="preserve"> </w:t>
@@ -13776,8 +13794,8 @@
         <w:t xml:space="preserve">. The best-first and commit-when-certain policies were simulated as described in the Model section, with beliefs and the last-fixated item carried across responses. Each trial was simulated five times per policy.</w:t>
       </w:r>
     </w:p>
-    <w:bookmarkEnd w:id="60"/>
-    <w:bookmarkStart w:id="61" w:name="parameter-estimation"/>
+    <w:bookmarkEnd w:id="61"/>
+    <w:bookmarkStart w:id="62" w:name="parameter-estimation"/>
     <w:p>
       <w:pPr>
         <w:pStyle w:val="Heading2"/>
@@ -14472,8 +14490,8 @@
         <w:t xml:space="preserve">, this objective serves only to choose parameters; the model is evaluated on the full set of patterns in the figures. Dwell shares were not fitted, because the spatial error of the webcam tracker attenuates them in the data, and are shown as predictions. All figures show the odd-numbered trials, for the data and for the policies simulated at their best-fitting parameters (Table 2).</w:t>
       </w:r>
     </w:p>
-    <w:bookmarkEnd w:id="61"/>
-    <w:bookmarkStart w:id="62" w:name="statistical-analysis"/>
+    <w:bookmarkEnd w:id="62"/>
+    <w:bookmarkStart w:id="63" w:name="statistical-analysis"/>
     <w:p>
       <w:pPr>
         <w:pStyle w:val="Heading2"/>
@@ -14487,7 +14505,7 @@
         <w:pStyle w:val="FirstParagraph"/>
       </w:pPr>
       <w:r>
-        <w:t xml:space="preserve">Summary statistics were computed per participant and then averaged, with 95% confidence intervals from 500 bootstrap resamples of participants. Regression analyses used linear and logistic mixed-effects models with random intercepts for participants, fitted with lme4</w:t>
+        <w:t xml:space="preserve">Summary statistics were computed per participant and then averaged, with 95% confidence intervals from 500 bootstrap resamples of participants. Regression analyses used linear and logistic mixed-effects models with random intercepts for participants, fitted with lme4 (version 2.0.1)</w:t>
       </w:r>
       <w:r>
         <w:t xml:space="preserve"> </w:t>
@@ -14499,7 +14517,7 @@
         <w:t xml:space="preserve"> </w:t>
       </w:r>
       <w:r>
-        <w:t xml:space="preserve">in R</w:t>
+        <w:t xml:space="preserve">in R 4.5</w:t>
       </w:r>
       <w:r>
         <w:t xml:space="preserve"> </w:t>
@@ -14658,8 +14676,8 @@
         <w:t xml:space="preserve">statistic across participants (a paired statistic for the difference between selection sizes), formed clusters of adjacent bins whose statistic exceeded the two-sided 0.05 threshold, summed the statistics within each cluster, and compared each cluster’s mass with the distribution of the largest absolute mass under 5000 random sign flips of participants’ indices.</w:t>
       </w:r>
     </w:p>
-    <w:bookmarkEnd w:id="62"/>
-    <w:bookmarkStart w:id="63" w:name="data-and-code-availability"/>
+    <w:bookmarkEnd w:id="63"/>
+    <w:bookmarkStart w:id="64" w:name="data-and-code-availability"/>
     <w:p>
       <w:pPr>
         <w:pStyle w:val="Heading2"/>
@@ -14673,12 +14691,12 @@
         <w:pStyle w:val="FirstParagraph"/>
       </w:pPr>
       <w:r>
-        <w:t xml:space="preserve">The data, the model and analysis code, and the scripts that reproduce every figure are available at https://github.com/kiante-fernandez/optimal-attention; a release of the repository will be archived with a DOI before publication.</w:t>
+        <w:t xml:space="preserve">The data, the model and analysis code, and the scripts that reproduce every figure are available at https://github.com/kiante-fernandez/optimal-attention.</w:t>
       </w:r>
     </w:p>
-    <w:bookmarkEnd w:id="63"/>
     <w:bookmarkEnd w:id="64"/>
-    <w:bookmarkStart w:id="65" w:name="supporting-information"/>
+    <w:bookmarkEnd w:id="65"/>
+    <w:bookmarkStart w:id="66" w:name="supporting-information"/>
     <w:p>
       <w:pPr>
         <w:pStyle w:val="Heading1"/>
@@ -14753,8 +14771,8 @@
         <w:t xml:space="preserve">, the three response policies as algorithms, the details of the parameter search, the validation of the directed-cognition approximation against the exact optimal policy in a Bernoulli version of the task, and the parameter and policy recovery analysis.</w:t>
       </w:r>
     </w:p>
-    <w:bookmarkEnd w:id="65"/>
-    <w:bookmarkStart w:id="194" w:name="references"/>
+    <w:bookmarkEnd w:id="66"/>
+    <w:bookmarkStart w:id="195" w:name="references"/>
     <w:p>
       <w:pPr>
         <w:pStyle w:val="Heading1"/>
@@ -14763,8 +14781,8 @@
         <w:t xml:space="preserve">References</w:t>
       </w:r>
     </w:p>
-    <w:bookmarkStart w:id="193" w:name="refs"/>
-    <w:bookmarkStart w:id="67" w:name="ref-ratcliff2008"/>
+    <w:bookmarkStart w:id="194" w:name="refs"/>
+    <w:bookmarkStart w:id="68" w:name="ref-ratcliff2008"/>
     <w:p>
       <w:pPr>
         <w:pStyle w:val="Bibliography"/>
@@ -14781,7 +14799,7 @@
       <w:r>
         <w:t xml:space="preserve">Ratcliff R, McKoon G. The diffusion decision model: Theory and data for two-choice decision tasks. Neural Computation. 2008;20(4):873–922. doi:</w:t>
       </w:r>
-      <w:hyperlink r:id="rId66">
+      <w:hyperlink r:id="rId67">
         <w:r>
           <w:rPr>
             <w:rStyle w:val="Hyperlink"/>
@@ -14790,8 +14808,8 @@
         </w:r>
       </w:hyperlink>
     </w:p>
-    <w:bookmarkEnd w:id="67"/>
-    <w:bookmarkStart w:id="69" w:name="ref-usher2001"/>
+    <w:bookmarkEnd w:id="68"/>
+    <w:bookmarkStart w:id="70" w:name="ref-usher2001"/>
     <w:p>
       <w:pPr>
         <w:pStyle w:val="Bibliography"/>
@@ -14808,7 +14826,7 @@
       <w:r>
         <w:t xml:space="preserve">Usher M, McClelland JL. The time course of perceptual choice: The leaky, competing accumulator model. Psychological Review. 2001;108(3):550–92. doi:</w:t>
       </w:r>
-      <w:hyperlink r:id="rId68">
+      <w:hyperlink r:id="rId69">
         <w:r>
           <w:rPr>
             <w:rStyle w:val="Hyperlink"/>
@@ -14817,8 +14835,8 @@
         </w:r>
       </w:hyperlink>
     </w:p>
-    <w:bookmarkEnd w:id="69"/>
-    <w:bookmarkStart w:id="71" w:name="ref-milosavljevic2010"/>
+    <w:bookmarkEnd w:id="70"/>
+    <w:bookmarkStart w:id="72" w:name="ref-milosavljevic2010"/>
     <w:p>
       <w:pPr>
         <w:pStyle w:val="Bibliography"/>
@@ -14835,7 +14853,7 @@
       <w:r>
         <w:t xml:space="preserve">Milosavljevic M, Malmaud J, Huth A, Koch C, Rangel A. The drift diffusion model can account for the accuracy and reaction time of value-based choices under high and low time pressure. Judgment and Decision Making. 2010;5(6):437–49. doi:</w:t>
       </w:r>
-      <w:hyperlink r:id="rId70">
+      <w:hyperlink r:id="rId71">
         <w:r>
           <w:rPr>
             <w:rStyle w:val="Hyperlink"/>
@@ -14844,8 +14862,8 @@
         </w:r>
       </w:hyperlink>
     </w:p>
-    <w:bookmarkEnd w:id="71"/>
-    <w:bookmarkStart w:id="73" w:name="ref-busemeyer1993"/>
+    <w:bookmarkEnd w:id="72"/>
+    <w:bookmarkStart w:id="74" w:name="ref-busemeyer1993"/>
     <w:p>
       <w:pPr>
         <w:pStyle w:val="Bibliography"/>
@@ -14862,7 +14880,7 @@
       <w:r>
         <w:t xml:space="preserve">Busemeyer JR, Townsend JT. Decision field theory: A dynamic-cognitive approach to decision making in an uncertain environment. Psychological Review. 1993;100(3):432–59. doi:</w:t>
       </w:r>
-      <w:hyperlink r:id="rId72">
+      <w:hyperlink r:id="rId73">
         <w:r>
           <w:rPr>
             <w:rStyle w:val="Hyperlink"/>
@@ -14871,8 +14889,8 @@
         </w:r>
       </w:hyperlink>
     </w:p>
-    <w:bookmarkEnd w:id="73"/>
-    <w:bookmarkStart w:id="75" w:name="ref-shimojo2003"/>
+    <w:bookmarkEnd w:id="74"/>
+    <w:bookmarkStart w:id="76" w:name="ref-shimojo2003"/>
     <w:p>
       <w:pPr>
         <w:pStyle w:val="Bibliography"/>
@@ -14889,7 +14907,7 @@
       <w:r>
         <w:t xml:space="preserve">Shimojo S, Simion C, Shimojo E, Scheier C. Gaze bias both reflects and influences preference. Nature Neuroscience. 2003;6(12):1317–22. doi:</w:t>
       </w:r>
-      <w:hyperlink r:id="rId74">
+      <w:hyperlink r:id="rId75">
         <w:r>
           <w:rPr>
             <w:rStyle w:val="Hyperlink"/>
@@ -14898,8 +14916,8 @@
         </w:r>
       </w:hyperlink>
     </w:p>
-    <w:bookmarkEnd w:id="75"/>
-    <w:bookmarkStart w:id="77" w:name="ref-krajbich2010"/>
+    <w:bookmarkEnd w:id="76"/>
+    <w:bookmarkStart w:id="78" w:name="ref-krajbich2010"/>
     <w:p>
       <w:pPr>
         <w:pStyle w:val="Bibliography"/>
@@ -14916,7 +14934,7 @@
       <w:r>
         <w:t xml:space="preserve">Krajbich I, Armel C, Rangel A. Visual fixations and the computation and comparison of value in simple choice. Nature Neuroscience. 2010;13(10):1292–8. doi:</w:t>
       </w:r>
-      <w:hyperlink r:id="rId76">
+      <w:hyperlink r:id="rId77">
         <w:r>
           <w:rPr>
             <w:rStyle w:val="Hyperlink"/>
@@ -14925,8 +14943,8 @@
         </w:r>
       </w:hyperlink>
     </w:p>
-    <w:bookmarkEnd w:id="77"/>
-    <w:bookmarkStart w:id="79" w:name="ref-krajbich2011"/>
+    <w:bookmarkEnd w:id="78"/>
+    <w:bookmarkStart w:id="80" w:name="ref-krajbich2011"/>
     <w:p>
       <w:pPr>
         <w:pStyle w:val="Bibliography"/>
@@ -14943,7 +14961,7 @@
       <w:r>
         <w:t xml:space="preserve">Krajbich I, Rangel A. Multialternative drift-diffusion model predicts the relationship between visual fixations and choice in value-based decisions. Proceedings of the National Academy of Sciences. 2011;108(33):13852–7. doi:</w:t>
       </w:r>
-      <w:hyperlink r:id="rId78">
+      <w:hyperlink r:id="rId79">
         <w:r>
           <w:rPr>
             <w:rStyle w:val="Hyperlink"/>
@@ -14952,8 +14970,8 @@
         </w:r>
       </w:hyperlink>
     </w:p>
-    <w:bookmarkEnd w:id="79"/>
-    <w:bookmarkStart w:id="81" w:name="ref-armel2008"/>
+    <w:bookmarkEnd w:id="80"/>
+    <w:bookmarkStart w:id="82" w:name="ref-armel2008"/>
     <w:p>
       <w:pPr>
         <w:pStyle w:val="Bibliography"/>
@@ -14970,7 +14988,7 @@
       <w:r>
         <w:t xml:space="preserve">Armel KC, Beaumel A, Rangel A. Biasing simple choices by manipulating relative visual attention. Judgment and Decision Making. 2008;3(5):396–403. doi:</w:t>
       </w:r>
-      <w:hyperlink r:id="rId80">
+      <w:hyperlink r:id="rId81">
         <w:r>
           <w:rPr>
             <w:rStyle w:val="Hyperlink"/>
@@ -14979,8 +14997,8 @@
         </w:r>
       </w:hyperlink>
     </w:p>
-    <w:bookmarkEnd w:id="81"/>
-    <w:bookmarkStart w:id="83" w:name="ref-smith2019"/>
+    <w:bookmarkEnd w:id="82"/>
+    <w:bookmarkStart w:id="84" w:name="ref-smith2019"/>
     <w:p>
       <w:pPr>
         <w:pStyle w:val="Bibliography"/>
@@ -14997,7 +15015,7 @@
       <w:r>
         <w:t xml:space="preserve">Smith SM, Krajbich I. Gaze amplifies value in decision making. Psychological Science. 2019;30(1):116–28. doi:</w:t>
       </w:r>
-      <w:hyperlink r:id="rId82">
+      <w:hyperlink r:id="rId83">
         <w:r>
           <w:rPr>
             <w:rStyle w:val="Hyperlink"/>
@@ -15006,8 +15024,8 @@
         </w:r>
       </w:hyperlink>
     </w:p>
-    <w:bookmarkEnd w:id="83"/>
-    <w:bookmarkStart w:id="85" w:name="ref-bhatnagar2022"/>
+    <w:bookmarkEnd w:id="84"/>
+    <w:bookmarkStart w:id="86" w:name="ref-bhatnagar2022"/>
     <w:p>
       <w:pPr>
         <w:pStyle w:val="Bibliography"/>
@@ -15024,7 +15042,7 @@
       <w:r>
         <w:t xml:space="preserve">Bhatnagar R, Orquin JL. A meta-analysis on the effect of visual attention on choice. Journal of Experimental Psychology: General. 2022;151(10):2265–83. doi:</w:t>
       </w:r>
-      <w:hyperlink r:id="rId84">
+      <w:hyperlink r:id="rId85">
         <w:r>
           <w:rPr>
             <w:rStyle w:val="Hyperlink"/>
@@ -15033,8 +15051,8 @@
         </w:r>
       </w:hyperlink>
     </w:p>
-    <w:bookmarkEnd w:id="85"/>
-    <w:bookmarkStart w:id="87" w:name="ref-thomas2019"/>
+    <w:bookmarkEnd w:id="86"/>
+    <w:bookmarkStart w:id="88" w:name="ref-thomas2019"/>
     <w:p>
       <w:pPr>
         <w:pStyle w:val="Bibliography"/>
@@ -15051,7 +15069,7 @@
       <w:r>
         <w:t xml:space="preserve">Thomas AW, Molter F, Krajbich I, Heekeren HR, Mohr PNC. Gaze bias differences capture individual choice behaviour. Nature Human Behaviour. 2019;3(6):625–35. doi:</w:t>
       </w:r>
-      <w:hyperlink r:id="rId86">
+      <w:hyperlink r:id="rId87">
         <w:r>
           <w:rPr>
             <w:rStyle w:val="Hyperlink"/>
@@ -15060,8 +15078,8 @@
         </w:r>
       </w:hyperlink>
     </w:p>
-    <w:bookmarkEnd w:id="87"/>
-    <w:bookmarkStart w:id="89" w:name="ref-krajbich2019"/>
+    <w:bookmarkEnd w:id="88"/>
+    <w:bookmarkStart w:id="90" w:name="ref-krajbich2019"/>
     <w:p>
       <w:pPr>
         <w:pStyle w:val="Bibliography"/>
@@ -15078,7 +15096,7 @@
       <w:r>
         <w:t xml:space="preserve">Krajbich I. Accounting for attention in sequential sampling models of decision making. Current Opinion in Psychology. 2019;29:6–11. doi:</w:t>
       </w:r>
-      <w:hyperlink r:id="rId88">
+      <w:hyperlink r:id="rId89">
         <w:r>
           <w:rPr>
             <w:rStyle w:val="Hyperlink"/>
@@ -15087,8 +15105,8 @@
         </w:r>
       </w:hyperlink>
     </w:p>
-    <w:bookmarkEnd w:id="89"/>
-    <w:bookmarkStart w:id="91" w:name="ref-ting2024"/>
+    <w:bookmarkEnd w:id="90"/>
+    <w:bookmarkStart w:id="92" w:name="ref-ting2024"/>
     <w:p>
       <w:pPr>
         <w:pStyle w:val="Bibliography"/>
@@ -15105,7 +15123,7 @@
       <w:r>
         <w:t xml:space="preserve">Ting CC, Gluth S. Unraveling information processes of decision-making with eye-tracking data. Frontiers in Behavioral Economics. 2024;3:1384713. doi:</w:t>
       </w:r>
-      <w:hyperlink r:id="rId90">
+      <w:hyperlink r:id="rId91">
         <w:r>
           <w:rPr>
             <w:rStyle w:val="Hyperlink"/>
@@ -15114,8 +15132,8 @@
         </w:r>
       </w:hyperlink>
     </w:p>
-    <w:bookmarkEnd w:id="91"/>
-    <w:bookmarkStart w:id="93" w:name="ref-callaway2021"/>
+    <w:bookmarkEnd w:id="92"/>
+    <w:bookmarkStart w:id="94" w:name="ref-callaway2021"/>
     <w:p>
       <w:pPr>
         <w:pStyle w:val="Bibliography"/>
@@ -15132,7 +15150,7 @@
       <w:r>
         <w:t xml:space="preserve">Callaway F, Rangel A, Griffiths TL. Fixation patterns in simple choice reflect optimal information sampling. PLOS Computational Biology. 2021;17(3):e1008863. doi:</w:t>
       </w:r>
-      <w:hyperlink r:id="rId92">
+      <w:hyperlink r:id="rId93">
         <w:r>
           <w:rPr>
             <w:rStyle w:val="Hyperlink"/>
@@ -15141,8 +15159,8 @@
         </w:r>
       </w:hyperlink>
     </w:p>
-    <w:bookmarkEnd w:id="93"/>
-    <w:bookmarkStart w:id="95" w:name="ref-jang2021"/>
+    <w:bookmarkEnd w:id="94"/>
+    <w:bookmarkStart w:id="96" w:name="ref-jang2021"/>
     <w:p>
       <w:pPr>
         <w:pStyle w:val="Bibliography"/>
@@ -15159,7 +15177,7 @@
       <w:r>
         <w:t xml:space="preserve">Jang AI, Sharma R, Drugowitsch J. Optimal policy for attention-modulated decisions explains human fixation behavior. eLife. 2021;10:e63436. doi:</w:t>
       </w:r>
-      <w:hyperlink r:id="rId94">
+      <w:hyperlink r:id="rId95">
         <w:r>
           <w:rPr>
             <w:rStyle w:val="Hyperlink"/>
@@ -15168,8 +15186,8 @@
         </w:r>
       </w:hyperlink>
     </w:p>
-    <w:bookmarkEnd w:id="95"/>
-    <w:bookmarkStart w:id="97" w:name="ref-tajima2016"/>
+    <w:bookmarkEnd w:id="96"/>
+    <w:bookmarkStart w:id="98" w:name="ref-tajima2016"/>
     <w:p>
       <w:pPr>
         <w:pStyle w:val="Bibliography"/>
@@ -15186,7 +15204,7 @@
       <w:r>
         <w:t xml:space="preserve">Tajima S, Drugowitsch J, Pouget A. Optimal policy for value-based decision-making. Nature Communications. 2016;7:12400. doi:</w:t>
       </w:r>
-      <w:hyperlink r:id="rId96">
+      <w:hyperlink r:id="rId97">
         <w:r>
           <w:rPr>
             <w:rStyle w:val="Hyperlink"/>
@@ -15195,8 +15213,8 @@
         </w:r>
       </w:hyperlink>
     </w:p>
-    <w:bookmarkEnd w:id="97"/>
-    <w:bookmarkStart w:id="99" w:name="ref-tajima2019"/>
+    <w:bookmarkEnd w:id="98"/>
+    <w:bookmarkStart w:id="100" w:name="ref-tajima2019"/>
     <w:p>
       <w:pPr>
         <w:pStyle w:val="Bibliography"/>
@@ -15213,7 +15231,7 @@
       <w:r>
         <w:t xml:space="preserve">Tajima S, Drugowitsch J, Patel N, Pouget A. Optimal policy for multi-alternative decisions. Nature Neuroscience. 2019;22(9):1503–11. doi:</w:t>
       </w:r>
-      <w:hyperlink r:id="rId98">
+      <w:hyperlink r:id="rId99">
         <w:r>
           <w:rPr>
             <w:rStyle w:val="Hyperlink"/>
@@ -15222,8 +15240,8 @@
         </w:r>
       </w:hyperlink>
     </w:p>
-    <w:bookmarkEnd w:id="99"/>
-    <w:bookmarkStart w:id="101" w:name="ref-fudenberg2018"/>
+    <w:bookmarkEnd w:id="100"/>
+    <w:bookmarkStart w:id="102" w:name="ref-fudenberg2018"/>
     <w:p>
       <w:pPr>
         <w:pStyle w:val="Bibliography"/>
@@ -15240,7 +15258,7 @@
       <w:r>
         <w:t xml:space="preserve">Fudenberg D, Strack P, Strzalecki T. Speed, accuracy, and the optimal timing of choices. American Economic Review. 2018;108(12):3651–84. doi:</w:t>
       </w:r>
-      <w:hyperlink r:id="rId100">
+      <w:hyperlink r:id="rId101">
         <w:r>
           <w:rPr>
             <w:rStyle w:val="Hyperlink"/>
@@ -15249,8 +15267,8 @@
         </w:r>
       </w:hyperlink>
     </w:p>
-    <w:bookmarkEnd w:id="101"/>
-    <w:bookmarkStart w:id="103" w:name="ref-hebert2023"/>
+    <w:bookmarkEnd w:id="102"/>
+    <w:bookmarkStart w:id="104" w:name="ref-hebert2023"/>
     <w:p>
       <w:pPr>
         <w:pStyle w:val="Bibliography"/>
@@ -15267,7 +15285,7 @@
       <w:r>
         <w:t xml:space="preserve">Hébert B, Woodford M. Rational inattention when decisions take time. Journal of Economic Theory. 2023;208:105612. doi:</w:t>
       </w:r>
-      <w:hyperlink r:id="rId102">
+      <w:hyperlink r:id="rId103">
         <w:r>
           <w:rPr>
             <w:rStyle w:val="Hyperlink"/>
@@ -15276,8 +15294,8 @@
         </w:r>
       </w:hyperlink>
     </w:p>
-    <w:bookmarkEnd w:id="103"/>
-    <w:bookmarkStart w:id="105" w:name="ref-fromer2025"/>
+    <w:bookmarkEnd w:id="104"/>
+    <w:bookmarkStart w:id="106" w:name="ref-fromer2025"/>
     <w:p>
       <w:pPr>
         <w:pStyle w:val="Bibliography"/>
@@ -15294,7 +15312,7 @@
       <w:r>
         <w:t xml:space="preserve">Frömer R, Callaway F, Griffiths TL, Shenhav A. Considering what we know and what we don’t know: Expectations and confidence guide value integration in value-based decision-making. Open Mind: Discoveries in Cognitive Science. 2025;9:791–813. doi:</w:t>
       </w:r>
-      <w:hyperlink r:id="rId104">
+      <w:hyperlink r:id="rId105">
         <w:r>
           <w:rPr>
             <w:rStyle w:val="Hyperlink"/>
@@ -15303,8 +15321,8 @@
         </w:r>
       </w:hyperlink>
     </w:p>
-    <w:bookmarkEnd w:id="105"/>
-    <w:bookmarkStart w:id="107" w:name="ref-russell1991"/>
+    <w:bookmarkEnd w:id="106"/>
+    <w:bookmarkStart w:id="108" w:name="ref-russell1991"/>
     <w:p>
       <w:pPr>
         <w:pStyle w:val="Bibliography"/>
@@ -15321,7 +15339,7 @@
       <w:r>
         <w:t xml:space="preserve">Russell S, Wefald E. Principles of metareasoning. Artificial Intelligence. 1991;49(1-3):361–95. doi:</w:t>
       </w:r>
-      <w:hyperlink r:id="rId106">
+      <w:hyperlink r:id="rId107">
         <w:r>
           <w:rPr>
             <w:rStyle w:val="Hyperlink"/>
@@ -15330,8 +15348,8 @@
         </w:r>
       </w:hyperlink>
     </w:p>
-    <w:bookmarkEnd w:id="107"/>
-    <w:bookmarkStart w:id="109" w:name="ref-hay2012"/>
+    <w:bookmarkEnd w:id="108"/>
+    <w:bookmarkStart w:id="110" w:name="ref-hay2012"/>
     <w:p>
       <w:pPr>
         <w:pStyle w:val="Bibliography"/>
@@ -15360,7 +15378,7 @@
       <w:r>
         <w:t xml:space="preserve"> </w:t>
       </w:r>
-      <w:hyperlink r:id="rId108">
+      <w:hyperlink r:id="rId109">
         <w:r>
           <w:rPr>
             <w:rStyle w:val="Hyperlink"/>
@@ -15369,8 +15387,8 @@
         </w:r>
       </w:hyperlink>
     </w:p>
-    <w:bookmarkEnd w:id="109"/>
-    <w:bookmarkStart w:id="111" w:name="ref-lieder2020"/>
+    <w:bookmarkEnd w:id="110"/>
+    <w:bookmarkStart w:id="112" w:name="ref-lieder2020"/>
     <w:p>
       <w:pPr>
         <w:pStyle w:val="Bibliography"/>
@@ -15387,7 +15405,7 @@
       <w:r>
         <w:t xml:space="preserve">Lieder F, Griffiths TL. Resource-rational analysis: Understanding human cognition as the optimal use of limited computational resources. Behavioral and Brain Sciences. 2020;43:e1. doi:</w:t>
       </w:r>
-      <w:hyperlink r:id="rId110">
+      <w:hyperlink r:id="rId111">
         <w:r>
           <w:rPr>
             <w:rStyle w:val="Hyperlink"/>
@@ -15396,8 +15414,8 @@
         </w:r>
       </w:hyperlink>
     </w:p>
-    <w:bookmarkEnd w:id="111"/>
-    <w:bookmarkStart w:id="112" w:name="ref-lieder2026"/>
+    <w:bookmarkEnd w:id="112"/>
+    <w:bookmarkStart w:id="113" w:name="ref-lieder2026"/>
     <w:p>
       <w:pPr>
         <w:pStyle w:val="Bibliography"/>
@@ -15415,8 +15433,8 @@
         <w:t xml:space="preserve">Lieder F, Callaway F, Griffiths TL. The rational use of cognitive resources. Princeton, NJ: Princeton University Press; 2026.</w:t>
       </w:r>
     </w:p>
-    <w:bookmarkEnd w:id="112"/>
-    <w:bookmarkStart w:id="114" w:name="ref-simon1955"/>
+    <w:bookmarkEnd w:id="113"/>
+    <w:bookmarkStart w:id="115" w:name="ref-simon1955"/>
     <w:p>
       <w:pPr>
         <w:pStyle w:val="Bibliography"/>
@@ -15433,7 +15451,7 @@
       <w:r>
         <w:t xml:space="preserve">Simon HA. A behavioral model of rational choice. The Quarterly Journal of Economics. 1955;69(1):99–118. doi:</w:t>
       </w:r>
-      <w:hyperlink r:id="rId113">
+      <w:hyperlink r:id="rId114">
         <w:r>
           <w:rPr>
             <w:rStyle w:val="Hyperlink"/>
@@ -15442,8 +15460,8 @@
         </w:r>
       </w:hyperlink>
     </w:p>
-    <w:bookmarkEnd w:id="114"/>
-    <w:bookmarkStart w:id="116" w:name="ref-russell1995"/>
+    <w:bookmarkEnd w:id="115"/>
+    <w:bookmarkStart w:id="117" w:name="ref-russell1995"/>
     <w:p>
       <w:pPr>
         <w:pStyle w:val="Bibliography"/>
@@ -15460,7 +15478,7 @@
       <w:r>
         <w:t xml:space="preserve">Russell SJ, Subramanian D. Provably bounded-optimal agents. Journal of Artificial Intelligence Research. 1995;2:575–609. doi:</w:t>
       </w:r>
-      <w:hyperlink r:id="rId115">
+      <w:hyperlink r:id="rId116">
         <w:r>
           <w:rPr>
             <w:rStyle w:val="Hyperlink"/>
@@ -15469,8 +15487,8 @@
         </w:r>
       </w:hyperlink>
     </w:p>
-    <w:bookmarkEnd w:id="116"/>
-    <w:bookmarkStart w:id="118" w:name="ref-lewis2014"/>
+    <w:bookmarkEnd w:id="117"/>
+    <w:bookmarkStart w:id="119" w:name="ref-lewis2014"/>
     <w:p>
       <w:pPr>
         <w:pStyle w:val="Bibliography"/>
@@ -15487,7 +15505,7 @@
       <w:r>
         <w:t xml:space="preserve">Lewis RL, Howes A, Singh S. Computational rationality: Linking mechanism and behavior through bounded utility maximization. Topics in Cognitive Science. 2014;6(2):279–311. doi:</w:t>
       </w:r>
-      <w:hyperlink r:id="rId117">
+      <w:hyperlink r:id="rId118">
         <w:r>
           <w:rPr>
             <w:rStyle w:val="Hyperlink"/>
@@ -15496,8 +15514,8 @@
         </w:r>
       </w:hyperlink>
     </w:p>
-    <w:bookmarkEnd w:id="118"/>
-    <w:bookmarkStart w:id="120" w:name="ref-griffiths2015"/>
+    <w:bookmarkEnd w:id="119"/>
+    <w:bookmarkStart w:id="121" w:name="ref-griffiths2015"/>
     <w:p>
       <w:pPr>
         <w:pStyle w:val="Bibliography"/>
@@ -15514,7 +15532,7 @@
       <w:r>
         <w:t xml:space="preserve">Griffiths TL, Lieder F, Goodman ND. Rational use of cognitive resources: Levels of analysis between the computational and the algorithmic. Topics in Cognitive Science. 2015;7(2):217–29. doi:</w:t>
       </w:r>
-      <w:hyperlink r:id="rId119">
+      <w:hyperlink r:id="rId120">
         <w:r>
           <w:rPr>
             <w:rStyle w:val="Hyperlink"/>
@@ -15523,8 +15541,8 @@
         </w:r>
       </w:hyperlink>
     </w:p>
-    <w:bookmarkEnd w:id="120"/>
-    <w:bookmarkStart w:id="122" w:name="ref-gershman2015"/>
+    <w:bookmarkEnd w:id="121"/>
+    <w:bookmarkStart w:id="123" w:name="ref-gershman2015"/>
     <w:p>
       <w:pPr>
         <w:pStyle w:val="Bibliography"/>
@@ -15541,7 +15559,7 @@
       <w:r>
         <w:t xml:space="preserve">Gershman SJ, Horvitz EJ, Tenenbaum JB. Computational rationality: A converging paradigm for intelligence in brains, minds, and machines. Science. 2015;349(6245):273–8. doi:</w:t>
       </w:r>
-      <w:hyperlink r:id="rId121">
+      <w:hyperlink r:id="rId122">
         <w:r>
           <w:rPr>
             <w:rStyle w:val="Hyperlink"/>
@@ -15550,8 +15568,8 @@
         </w:r>
       </w:hyperlink>
     </w:p>
-    <w:bookmarkEnd w:id="122"/>
-    <w:bookmarkStart w:id="124" w:name="ref-najemnik2005"/>
+    <w:bookmarkEnd w:id="123"/>
+    <w:bookmarkStart w:id="125" w:name="ref-najemnik2005"/>
     <w:p>
       <w:pPr>
         <w:pStyle w:val="Bibliography"/>
@@ -15568,7 +15586,7 @@
       <w:r>
         <w:t xml:space="preserve">Najemnik J, Geisler WS. Optimal eye movement strategies in visual search. Nature. 2005;434(7031):387–91. doi:</w:t>
       </w:r>
-      <w:hyperlink r:id="rId123">
+      <w:hyperlink r:id="rId124">
         <w:r>
           <w:rPr>
             <w:rStyle w:val="Hyperlink"/>
@@ -15577,8 +15595,8 @@
         </w:r>
       </w:hyperlink>
     </w:p>
-    <w:bookmarkEnd w:id="124"/>
-    <w:bookmarkStart w:id="126" w:name="ref-yang2016"/>
+    <w:bookmarkEnd w:id="125"/>
+    <w:bookmarkStart w:id="127" w:name="ref-yang2016"/>
     <w:p>
       <w:pPr>
         <w:pStyle w:val="Bibliography"/>
@@ -15595,7 +15613,7 @@
       <w:r>
         <w:t xml:space="preserve">Yang SCH, Lengyel M, Wolpert DM. Active sensing in the categorization of visual patterns. eLife. 2016;5:e12215. doi:</w:t>
       </w:r>
-      <w:hyperlink r:id="rId125">
+      <w:hyperlink r:id="rId126">
         <w:r>
           <w:rPr>
             <w:rStyle w:val="Hyperlink"/>
@@ -15604,8 +15622,8 @@
         </w:r>
       </w:hyperlink>
     </w:p>
-    <w:bookmarkEnd w:id="126"/>
-    <w:bookmarkStart w:id="128" w:name="ref-gottlieb2012"/>
+    <w:bookmarkEnd w:id="127"/>
+    <w:bookmarkStart w:id="129" w:name="ref-gottlieb2012"/>
     <w:p>
       <w:pPr>
         <w:pStyle w:val="Bibliography"/>
@@ -15622,7 +15640,7 @@
       <w:r>
         <w:t xml:space="preserve">Gottlieb J. Attention, learning, and the value of information. Neuron. 2012;76(2):281–95. doi:</w:t>
       </w:r>
-      <w:hyperlink r:id="rId127">
+      <w:hyperlink r:id="rId128">
         <w:r>
           <w:rPr>
             <w:rStyle w:val="Hyperlink"/>
@@ -15631,8 +15649,8 @@
         </w:r>
       </w:hyperlink>
     </w:p>
-    <w:bookmarkEnd w:id="128"/>
-    <w:bookmarkStart w:id="130" w:name="ref-hoppe2016"/>
+    <w:bookmarkEnd w:id="129"/>
+    <w:bookmarkStart w:id="131" w:name="ref-hoppe2016"/>
     <w:p>
       <w:pPr>
         <w:pStyle w:val="Bibliography"/>
@@ -15649,7 +15667,7 @@
       <w:r>
         <w:t xml:space="preserve">Hoppe D, Rothkopf CA. Learning rational temporal eye movement strategies. Proceedings of the National Academy of Sciences. 2016;113(29):8332–7. doi:</w:t>
       </w:r>
-      <w:hyperlink r:id="rId129">
+      <w:hyperlink r:id="rId130">
         <w:r>
           <w:rPr>
             <w:rStyle w:val="Hyperlink"/>
@@ -15658,8 +15676,8 @@
         </w:r>
       </w:hyperlink>
     </w:p>
-    <w:bookmarkEnd w:id="130"/>
-    <w:bookmarkStart w:id="132" w:name="ref-callaway2022"/>
+    <w:bookmarkEnd w:id="131"/>
+    <w:bookmarkStart w:id="133" w:name="ref-callaway2022"/>
     <w:p>
       <w:pPr>
         <w:pStyle w:val="Bibliography"/>
@@ -15676,7 +15694,7 @@
       <w:r>
         <w:t xml:space="preserve">Callaway F, Opheusden B van, Gul S, Das P, Krueger PM, Griffiths TL, et al. Rational use of cognitive resources in human planning. Nature Human Behaviour. 2022;6(8):1112–25. doi:</w:t>
       </w:r>
-      <w:hyperlink r:id="rId131">
+      <w:hyperlink r:id="rId132">
         <w:r>
           <w:rPr>
             <w:rStyle w:val="Hyperlink"/>
@@ -15685,8 +15703,8 @@
         </w:r>
       </w:hyperlink>
     </w:p>
-    <w:bookmarkEnd w:id="132"/>
-    <w:bookmarkStart w:id="134" w:name="ref-callaway2024"/>
+    <w:bookmarkEnd w:id="133"/>
+    <w:bookmarkStart w:id="135" w:name="ref-callaway2024"/>
     <w:p>
       <w:pPr>
         <w:pStyle w:val="Bibliography"/>
@@ -15703,7 +15721,7 @@
       <w:r>
         <w:t xml:space="preserve">Callaway F, Griffiths TL, Norman KA, Zhang Q. Optimal metacognitive control of memory recall. Psychological Review. 2024;131(3):781–811. doi:</w:t>
       </w:r>
-      <w:hyperlink r:id="rId133">
+      <w:hyperlink r:id="rId134">
         <w:r>
           <w:rPr>
             <w:rStyle w:val="Hyperlink"/>
@@ -15712,8 +15730,8 @@
         </w:r>
       </w:hyperlink>
     </w:p>
-    <w:bookmarkEnd w:id="134"/>
-    <w:bookmarkStart w:id="136" w:name="ref-ma2026"/>
+    <w:bookmarkEnd w:id="135"/>
+    <w:bookmarkStart w:id="137" w:name="ref-ma2026"/>
     <w:p>
       <w:pPr>
         <w:pStyle w:val="Bibliography"/>
@@ -15730,7 +15748,7 @@
       <w:r>
         <w:t xml:space="preserve">Ma S, Popov V, Zhang Q. Cognitive constraints and reward environments jointly shape memory formation. Psychological Review. 2026. doi:</w:t>
       </w:r>
-      <w:hyperlink r:id="rId135">
+      <w:hyperlink r:id="rId136">
         <w:r>
           <w:rPr>
             <w:rStyle w:val="Hyperlink"/>
@@ -15739,8 +15757,8 @@
         </w:r>
       </w:hyperlink>
     </w:p>
-    <w:bookmarkEnd w:id="136"/>
-    <w:bookmarkStart w:id="138" w:name="ref-reutskaja2011"/>
+    <w:bookmarkEnd w:id="137"/>
+    <w:bookmarkStart w:id="139" w:name="ref-reutskaja2011"/>
     <w:p>
       <w:pPr>
         <w:pStyle w:val="Bibliography"/>
@@ -15757,7 +15775,7 @@
       <w:r>
         <w:t xml:space="preserve">Reutskaja E, Nagel R, Camerer CF, Rangel A. Search dynamics in consumer choice under time pressure: An eye-tracking study. American Economic Review. 2011;101(2):900–26. doi:</w:t>
       </w:r>
-      <w:hyperlink r:id="rId137">
+      <w:hyperlink r:id="rId138">
         <w:r>
           <w:rPr>
             <w:rStyle w:val="Hyperlink"/>
@@ -15766,8 +15784,8 @@
         </w:r>
       </w:hyperlink>
     </w:p>
-    <w:bookmarkEnd w:id="138"/>
-    <w:bookmarkStart w:id="140" w:name="ref-russo1994"/>
+    <w:bookmarkEnd w:id="139"/>
+    <w:bookmarkStart w:id="141" w:name="ref-russo1994"/>
     <w:p>
       <w:pPr>
         <w:pStyle w:val="Bibliography"/>
@@ -15784,7 +15802,7 @@
       <w:r>
         <w:t xml:space="preserve">Russo JE, Leclerc F. An eye-fixation analysis of choice processes for consumer nondurables. Journal of Consumer Research. 1994;21(2):274–90. doi:</w:t>
       </w:r>
-      <w:hyperlink r:id="rId139">
+      <w:hyperlink r:id="rId140">
         <w:r>
           <w:rPr>
             <w:rStyle w:val="Hyperlink"/>
@@ -15793,8 +15811,8 @@
         </w:r>
       </w:hyperlink>
     </w:p>
-    <w:bookmarkEnd w:id="140"/>
-    <w:bookmarkStart w:id="142" w:name="ref-gluth2018"/>
+    <w:bookmarkEnd w:id="141"/>
+    <w:bookmarkStart w:id="143" w:name="ref-gluth2018"/>
     <w:p>
       <w:pPr>
         <w:pStyle w:val="Bibliography"/>
@@ -15811,7 +15829,7 @@
       <w:r>
         <w:t xml:space="preserve">Gluth S, Spektor MS, Rieskamp J. Value-based attentional capture affects multi-alternative decision making. eLife. 2018;7:e39659. doi:</w:t>
       </w:r>
-      <w:hyperlink r:id="rId141">
+      <w:hyperlink r:id="rId142">
         <w:r>
           <w:rPr>
             <w:rStyle w:val="Hyperlink"/>
@@ -15820,8 +15838,8 @@
         </w:r>
       </w:hyperlink>
     </w:p>
-    <w:bookmarkEnd w:id="142"/>
-    <w:bookmarkStart w:id="144" w:name="ref-gluth2020"/>
+    <w:bookmarkEnd w:id="143"/>
+    <w:bookmarkStart w:id="145" w:name="ref-gluth2020"/>
     <w:p>
       <w:pPr>
         <w:pStyle w:val="Bibliography"/>
@@ -15838,7 +15856,7 @@
       <w:r>
         <w:t xml:space="preserve">Gluth S, Kern N, Kortmann M, Vitali CL. Value-based attention but not divisive normalization influences decisions with multiple alternatives. Nature Human Behaviour. 2020;4(6):634–45. doi:</w:t>
       </w:r>
-      <w:hyperlink r:id="rId143">
+      <w:hyperlink r:id="rId144">
         <w:r>
           <w:rPr>
             <w:rStyle w:val="Hyperlink"/>
@@ -15847,8 +15865,8 @@
         </w:r>
       </w:hyperlink>
     </w:p>
-    <w:bookmarkEnd w:id="144"/>
-    <w:bookmarkStart w:id="146" w:name="ref-fromer2026"/>
+    <w:bookmarkEnd w:id="145"/>
+    <w:bookmarkStart w:id="147" w:name="ref-fromer2026"/>
     <w:p>
       <w:pPr>
         <w:pStyle w:val="Bibliography"/>
@@ -15865,7 +15883,7 @@
       <w:r>
         <w:t xml:space="preserve">Froemer R, Ting CC, Shenhav A, Gluth S. Goals shape dynamics of attention and selection for value-based decisions. Topics in Cognitive Science. 2026;e70076. doi:</w:t>
       </w:r>
-      <w:hyperlink r:id="rId145">
+      <w:hyperlink r:id="rId146">
         <w:r>
           <w:rPr>
             <w:rStyle w:val="Hyperlink"/>
@@ -15874,8 +15892,8 @@
         </w:r>
       </w:hyperlink>
     </w:p>
-    <w:bookmarkEnd w:id="146"/>
-    <w:bookmarkStart w:id="148" w:name="ref-fromer2019"/>
+    <w:bookmarkEnd w:id="147"/>
+    <w:bookmarkStart w:id="149" w:name="ref-fromer2019"/>
     <w:p>
       <w:pPr>
         <w:pStyle w:val="Bibliography"/>
@@ -15892,7 +15910,7 @@
       <w:r>
         <w:t xml:space="preserve">Frömer R, Dean Wolf CK, Shenhav A. Goal congruency dominates reward value in accounting for behavioral and neural correlates of value-based decision-making. Nature Communications. 2019;10:4926. doi:</w:t>
       </w:r>
-      <w:hyperlink r:id="rId147">
+      <w:hyperlink r:id="rId148">
         <w:r>
           <w:rPr>
             <w:rStyle w:val="Hyperlink"/>
@@ -15901,8 +15919,8 @@
         </w:r>
       </w:hyperlink>
     </w:p>
-    <w:bookmarkEnd w:id="148"/>
-    <w:bookmarkStart w:id="150" w:name="ref-sepulveda2020"/>
+    <w:bookmarkEnd w:id="149"/>
+    <w:bookmarkStart w:id="151" w:name="ref-sepulveda2020"/>
     <w:p>
       <w:pPr>
         <w:pStyle w:val="Bibliography"/>
@@ -15919,7 +15937,7 @@
       <w:r>
         <w:t xml:space="preserve">Sepulveda P, Usher M, Davies N, Benson AA, Ortoleva P, De Martino B. Visual attention modulates the integration of goal-relevant evidence and not value. eLife. 2020;9:e60705. doi:</w:t>
       </w:r>
-      <w:hyperlink r:id="rId149">
+      <w:hyperlink r:id="rId150">
         <w:r>
           <w:rPr>
             <w:rStyle w:val="Hyperlink"/>
@@ -15928,8 +15946,8 @@
         </w:r>
       </w:hyperlink>
     </w:p>
-    <w:bookmarkEnd w:id="150"/>
-    <w:bookmarkStart w:id="152" w:name="ref-kovach2014"/>
+    <w:bookmarkEnd w:id="151"/>
+    <w:bookmarkStart w:id="153" w:name="ref-kovach2014"/>
     <w:p>
       <w:pPr>
         <w:pStyle w:val="Bibliography"/>
@@ -15946,7 +15964,7 @@
       <w:r>
         <w:t xml:space="preserve">Kovach CK, Sutterer MJ, Rushia SN, Teriakidis A, Jenison RL. Two systems drive attention to rewards. Frontiers in Psychology. 2014;5:46. doi:</w:t>
       </w:r>
-      <w:hyperlink r:id="rId151">
+      <w:hyperlink r:id="rId152">
         <w:r>
           <w:rPr>
             <w:rStyle w:val="Hyperlink"/>
@@ -15955,8 +15973,8 @@
         </w:r>
       </w:hyperlink>
     </w:p>
-    <w:bookmarkEnd w:id="152"/>
-    <w:bookmarkStart w:id="154" w:name="ref-simonson1990"/>
+    <w:bookmarkEnd w:id="153"/>
+    <w:bookmarkStart w:id="155" w:name="ref-simonson1990"/>
     <w:p>
       <w:pPr>
         <w:pStyle w:val="Bibliography"/>
@@ -15973,7 +15991,7 @@
       <w:r>
         <w:t xml:space="preserve">Simonson I. The effect of purchase quantity and timing on variety-seeking behavior. Journal of Marketing Research. 1990;27(2):150–62. doi:</w:t>
       </w:r>
-      <w:hyperlink r:id="rId153">
+      <w:hyperlink r:id="rId154">
         <w:r>
           <w:rPr>
             <w:rStyle w:val="Hyperlink"/>
@@ -15982,8 +16000,8 @@
         </w:r>
       </w:hyperlink>
     </w:p>
-    <w:bookmarkEnd w:id="154"/>
-    <w:bookmarkStart w:id="156" w:name="ref-read1995"/>
+    <w:bookmarkEnd w:id="155"/>
+    <w:bookmarkStart w:id="157" w:name="ref-read1995"/>
     <w:p>
       <w:pPr>
         <w:pStyle w:val="Bibliography"/>
@@ -16000,7 +16018,7 @@
       <w:r>
         <w:t xml:space="preserve">Read D, Loewenstein G. Diversification bias: Explaining the discrepancy in variety seeking between combined and separated choices. Journal of Experimental Psychology: Applied. 1995;1(1):34–49. doi:</w:t>
       </w:r>
-      <w:hyperlink r:id="rId155">
+      <w:hyperlink r:id="rId156">
         <w:r>
           <w:rPr>
             <w:rStyle w:val="Hyperlink"/>
@@ -16009,8 +16027,8 @@
         </w:r>
       </w:hyperlink>
     </w:p>
-    <w:bookmarkEnd w:id="156"/>
-    <w:bookmarkStart w:id="158" w:name="ref-leng2025"/>
+    <w:bookmarkEnd w:id="157"/>
+    <w:bookmarkStart w:id="159" w:name="ref-leng2025"/>
     <w:p>
       <w:pPr>
         <w:pStyle w:val="Bibliography"/>
@@ -16027,7 +16045,7 @@
       <w:r>
         <w:t xml:space="preserve">Leng X, Frömer R, Summe T, Shenhav A. Mutual inclusivity improves decision-making by smoothing out choice’s competitive edge. Nature Human Behaviour. 2025;9(3):521–33. doi:</w:t>
       </w:r>
-      <w:hyperlink r:id="rId157">
+      <w:hyperlink r:id="rId158">
         <w:r>
           <w:rPr>
             <w:rStyle w:val="Hyperlink"/>
@@ -16036,8 +16054,8 @@
         </w:r>
       </w:hyperlink>
     </w:p>
-    <w:bookmarkEnd w:id="158"/>
-    <w:bookmarkStart w:id="160" w:name="ref-gabaix2005"/>
+    <w:bookmarkEnd w:id="159"/>
+    <w:bookmarkStart w:id="161" w:name="ref-gabaix2005"/>
     <w:p>
       <w:pPr>
         <w:pStyle w:val="Bibliography"/>
@@ -16057,7 +16075,7 @@
       <w:r>
         <w:t xml:space="preserve"> </w:t>
       </w:r>
-      <w:hyperlink r:id="rId159">
+      <w:hyperlink r:id="rId160">
         <w:r>
           <w:rPr>
             <w:rStyle w:val="Hyperlink"/>
@@ -16066,8 +16084,8 @@
         </w:r>
       </w:hyperlink>
     </w:p>
-    <w:bookmarkEnd w:id="160"/>
-    <w:bookmarkStart w:id="162" w:name="ref-gabaix2006"/>
+    <w:bookmarkEnd w:id="161"/>
+    <w:bookmarkStart w:id="163" w:name="ref-gabaix2006"/>
     <w:p>
       <w:pPr>
         <w:pStyle w:val="Bibliography"/>
@@ -16084,7 +16102,7 @@
       <w:r>
         <w:t xml:space="preserve">Gabaix X, Laibson D, Moloche G, Weinberg S. Costly information acquisition: Experimental analysis of a boundedly rational model. American Economic Review. 2006;96(4):1043–68. doi:</w:t>
       </w:r>
-      <w:hyperlink r:id="rId161">
+      <w:hyperlink r:id="rId162">
         <w:r>
           <w:rPr>
             <w:rStyle w:val="Hyperlink"/>
@@ -16093,8 +16111,8 @@
         </w:r>
       </w:hyperlink>
     </w:p>
-    <w:bookmarkEnd w:id="162"/>
-    <w:bookmarkStart w:id="164" w:name="ref-callaway2018"/>
+    <w:bookmarkEnd w:id="163"/>
+    <w:bookmarkStart w:id="165" w:name="ref-callaway2018"/>
     <w:p>
       <w:pPr>
         <w:pStyle w:val="Bibliography"/>
@@ -16123,7 +16141,7 @@
       <w:r>
         <w:t xml:space="preserve"> </w:t>
       </w:r>
-      <w:hyperlink r:id="rId163">
+      <w:hyperlink r:id="rId164">
         <w:r>
           <w:rPr>
             <w:rStyle w:val="Hyperlink"/>
@@ -16132,8 +16150,8 @@
         </w:r>
       </w:hyperlink>
     </w:p>
-    <w:bookmarkEnd w:id="164"/>
-    <w:bookmarkStart w:id="166" w:name="ref-orquin2013"/>
+    <w:bookmarkEnd w:id="165"/>
+    <w:bookmarkStart w:id="167" w:name="ref-orquin2013"/>
     <w:p>
       <w:pPr>
         <w:pStyle w:val="Bibliography"/>
@@ -16150,7 +16168,7 @@
       <w:r>
         <w:t xml:space="preserve">Orquin JL, Mueller Loose S. Attention and choice: A review on eye movements in decision making. Acta Psychologica. 2013;144(1):190–206. doi:</w:t>
       </w:r>
-      <w:hyperlink r:id="rId165">
+      <w:hyperlink r:id="rId166">
         <w:r>
           <w:rPr>
             <w:rStyle w:val="Hyperlink"/>
@@ -16159,8 +16177,8 @@
         </w:r>
       </w:hyperlink>
     </w:p>
-    <w:bookmarkEnd w:id="166"/>
-    <w:bookmarkStart w:id="168" w:name="ref-maris2007"/>
+    <w:bookmarkEnd w:id="167"/>
+    <w:bookmarkStart w:id="169" w:name="ref-maris2007"/>
     <w:p>
       <w:pPr>
         <w:pStyle w:val="Bibliography"/>
@@ -16195,7 +16213,7 @@
       <w:r>
         <w:t xml:space="preserve">-data. Journal of Neuroscience Methods. 2007;164(1):177–90. doi:</w:t>
       </w:r>
-      <w:hyperlink r:id="rId167">
+      <w:hyperlink r:id="rId168">
         <w:r>
           <w:rPr>
             <w:rStyle w:val="Hyperlink"/>
@@ -16204,8 +16222,8 @@
         </w:r>
       </w:hyperlink>
     </w:p>
-    <w:bookmarkEnd w:id="168"/>
-    <w:bookmarkStart w:id="170" w:name="ref-payne1988"/>
+    <w:bookmarkEnd w:id="169"/>
+    <w:bookmarkStart w:id="171" w:name="ref-payne1988"/>
     <w:p>
       <w:pPr>
         <w:pStyle w:val="Bibliography"/>
@@ -16222,7 +16240,7 @@
       <w:r>
         <w:t xml:space="preserve">Payne JW, Bettman JR, Johnson EJ. Adaptive strategy selection in decision making. Journal of Experimental Psychology: Learning, Memory, and Cognition. 1988;14(3):534–52. doi:</w:t>
       </w:r>
-      <w:hyperlink r:id="rId169">
+      <w:hyperlink r:id="rId170">
         <w:r>
           <w:rPr>
             <w:rStyle w:val="Hyperlink"/>
@@ -16231,8 +16249,8 @@
         </w:r>
       </w:hyperlink>
     </w:p>
-    <w:bookmarkEnd w:id="170"/>
-    <w:bookmarkStart w:id="172" w:name="ref-lieder2017"/>
+    <w:bookmarkEnd w:id="171"/>
+    <w:bookmarkStart w:id="173" w:name="ref-lieder2017"/>
     <w:p>
       <w:pPr>
         <w:pStyle w:val="Bibliography"/>
@@ -16249,7 +16267,7 @@
       <w:r>
         <w:t xml:space="preserve">Lieder F, Griffiths TL. Strategy selection as rational metareasoning. Psychological Review. 2017;124(6):762–94. doi:</w:t>
       </w:r>
-      <w:hyperlink r:id="rId171">
+      <w:hyperlink r:id="rId172">
         <w:r>
           <w:rPr>
             <w:rStyle w:val="Hyperlink"/>
@@ -16258,8 +16276,8 @@
         </w:r>
       </w:hyperlink>
     </w:p>
-    <w:bookmarkEnd w:id="172"/>
-    <w:bookmarkStart w:id="174" w:name="ref-shenhav2017"/>
+    <w:bookmarkEnd w:id="173"/>
+    <w:bookmarkStart w:id="175" w:name="ref-shenhav2017"/>
     <w:p>
       <w:pPr>
         <w:pStyle w:val="Bibliography"/>
@@ -16276,7 +16294,7 @@
       <w:r>
         <w:t xml:space="preserve">Shenhav A, Musslick S, Lieder F, Kool W, Griffiths TL, Cohen JD, et al. Toward a rational and mechanistic account of mental effort. Annual Review of Neuroscience. 2017;40:99–124. doi:</w:t>
       </w:r>
-      <w:hyperlink r:id="rId173">
+      <w:hyperlink r:id="rId174">
         <w:r>
           <w:rPr>
             <w:rStyle w:val="Hyperlink"/>
@@ -16285,8 +16303,8 @@
         </w:r>
       </w:hyperlink>
     </w:p>
-    <w:bookmarkEnd w:id="174"/>
-    <w:bookmarkStart w:id="176" w:name="ref-kool2018"/>
+    <w:bookmarkEnd w:id="175"/>
+    <w:bookmarkStart w:id="177" w:name="ref-kool2018"/>
     <w:p>
       <w:pPr>
         <w:pStyle w:val="Bibliography"/>
@@ -16303,7 +16321,7 @@
       <w:r>
         <w:t xml:space="preserve">Kool W, Botvinick M. Mental labour. Nature Human Behaviour. 2018;2(12):899–908. doi:</w:t>
       </w:r>
-      <w:hyperlink r:id="rId175">
+      <w:hyperlink r:id="rId176">
         <w:r>
           <w:rPr>
             <w:rStyle w:val="Hyperlink"/>
@@ -16312,8 +16330,8 @@
         </w:r>
       </w:hyperlink>
     </w:p>
-    <w:bookmarkEnd w:id="176"/>
-    <w:bookmarkStart w:id="178" w:name="ref-krueger2024"/>
+    <w:bookmarkEnd w:id="177"/>
+    <w:bookmarkStart w:id="179" w:name="ref-krueger2024"/>
     <w:p>
       <w:pPr>
         <w:pStyle w:val="Bibliography"/>
@@ -16330,7 +16348,7 @@
       <w:r>
         <w:t xml:space="preserve">Krueger PM, Callaway F, Gul S, Griffiths TL, Lieder F. Identifying resource-rational heuristics for risky choice. Psychological Review. 2024;131(4):905–51. doi:</w:t>
       </w:r>
-      <w:hyperlink r:id="rId177">
+      <w:hyperlink r:id="rId178">
         <w:r>
           <w:rPr>
             <w:rStyle w:val="Hyperlink"/>
@@ -16339,8 +16357,8 @@
         </w:r>
       </w:hyperlink>
     </w:p>
-    <w:bookmarkEnd w:id="178"/>
-    <w:bookmarkStart w:id="180" w:name="ref-deleeuw2015"/>
+    <w:bookmarkEnd w:id="179"/>
+    <w:bookmarkStart w:id="181" w:name="ref-deleeuw2015"/>
     <w:p>
       <w:pPr>
         <w:pStyle w:val="Bibliography"/>
@@ -16390,7 +16408,7 @@
       <w:r>
         <w:t xml:space="preserve">browser. Behavior Research Methods. 2015;47(1):1–12. doi:</w:t>
       </w:r>
-      <w:hyperlink r:id="rId179">
+      <w:hyperlink r:id="rId180">
         <w:r>
           <w:rPr>
             <w:rStyle w:val="Hyperlink"/>
@@ -16399,8 +16417,8 @@
         </w:r>
       </w:hyperlink>
     </w:p>
-    <w:bookmarkEnd w:id="180"/>
-    <w:bookmarkStart w:id="182" w:name="ref-papoutsaki2016"/>
+    <w:bookmarkEnd w:id="181"/>
+    <w:bookmarkStart w:id="183" w:name="ref-papoutsaki2016"/>
     <w:p>
       <w:pPr>
         <w:pStyle w:val="Bibliography"/>
@@ -16435,7 +16453,7 @@
       <w:r>
         <w:t xml:space="preserve"> </w:t>
       </w:r>
-      <w:hyperlink r:id="rId181">
+      <w:hyperlink r:id="rId182">
         <w:r>
           <w:rPr>
             <w:rStyle w:val="Hyperlink"/>
@@ -16444,8 +16462,8 @@
         </w:r>
       </w:hyperlink>
     </w:p>
-    <w:bookmarkEnd w:id="182"/>
-    <w:bookmarkStart w:id="184" w:name="ref-yang2021"/>
+    <w:bookmarkEnd w:id="183"/>
+    <w:bookmarkStart w:id="185" w:name="ref-yang2021"/>
     <w:p>
       <w:pPr>
         <w:pStyle w:val="Bibliography"/>
@@ -16462,7 +16480,7 @@
       <w:r>
         <w:t xml:space="preserve">Yang X, Krajbich I. Webcam-based online eye-tracking for behavioral research. Judgment and Decision Making. 2021;16(6):1485–505. doi:</w:t>
       </w:r>
-      <w:hyperlink r:id="rId183">
+      <w:hyperlink r:id="rId184">
         <w:r>
           <w:rPr>
             <w:rStyle w:val="Hyperlink"/>
@@ -16471,8 +16489,8 @@
         </w:r>
       </w:hyperlink>
     </w:p>
-    <w:bookmarkEnd w:id="184"/>
-    <w:bookmarkStart w:id="186" w:name="ref-semmelmann2018"/>
+    <w:bookmarkEnd w:id="185"/>
+    <w:bookmarkStart w:id="187" w:name="ref-semmelmann2018"/>
     <w:p>
       <w:pPr>
         <w:pStyle w:val="Bibliography"/>
@@ -16489,7 +16507,7 @@
       <w:r>
         <w:t xml:space="preserve">Semmelmann K, Weigelt S. Online webcam-based eye tracking in cognitive science: A first look. Behavior Research Methods. 2018;50(2):451–65. doi:</w:t>
       </w:r>
-      <w:hyperlink r:id="rId185">
+      <w:hyperlink r:id="rId186">
         <w:r>
           <w:rPr>
             <w:rStyle w:val="Hyperlink"/>
@@ -16498,8 +16516,8 @@
         </w:r>
       </w:hyperlink>
     </w:p>
-    <w:bookmarkEnd w:id="186"/>
-    <w:bookmarkStart w:id="188" w:name="ref-bezanson2017"/>
+    <w:bookmarkEnd w:id="187"/>
+    <w:bookmarkStart w:id="189" w:name="ref-bezanson2017"/>
     <w:p>
       <w:pPr>
         <w:pStyle w:val="Bibliography"/>
@@ -16525,7 +16543,7 @@
       <w:r>
         <w:t xml:space="preserve">: A fresh approach to numerical computing. SIAM Review. 2017;59(1):65–98. doi:</w:t>
       </w:r>
-      <w:hyperlink r:id="rId187">
+      <w:hyperlink r:id="rId188">
         <w:r>
           <w:rPr>
             <w:rStyle w:val="Hyperlink"/>
@@ -16534,8 +16552,8 @@
         </w:r>
       </w:hyperlink>
     </w:p>
-    <w:bookmarkEnd w:id="188"/>
-    <w:bookmarkStart w:id="190" w:name="ref-bates2015"/>
+    <w:bookmarkEnd w:id="189"/>
+    <w:bookmarkStart w:id="191" w:name="ref-bates2015"/>
     <w:p>
       <w:pPr>
         <w:pStyle w:val="Bibliography"/>
@@ -16561,7 +16579,7 @@
       <w:r>
         <w:t xml:space="preserve">. Journal of Statistical Software. 2015;67(1):1–48. doi:</w:t>
       </w:r>
-      <w:hyperlink r:id="rId189">
+      <w:hyperlink r:id="rId190">
         <w:r>
           <w:rPr>
             <w:rStyle w:val="Hyperlink"/>
@@ -16570,8 +16588,8 @@
         </w:r>
       </w:hyperlink>
     </w:p>
-    <w:bookmarkEnd w:id="190"/>
-    <w:bookmarkStart w:id="192" w:name="ref-rcoreteam2025"/>
+    <w:bookmarkEnd w:id="191"/>
+    <w:bookmarkStart w:id="193" w:name="ref-rcoreteam2025"/>
     <w:p>
       <w:pPr>
         <w:pStyle w:val="Bibliography"/>
@@ -16591,7 +16609,7 @@
       <w:r>
         <w:t xml:space="preserve"> </w:t>
       </w:r>
-      <w:hyperlink r:id="rId191">
+      <w:hyperlink r:id="rId192">
         <w:r>
           <w:rPr>
             <w:rStyle w:val="Hyperlink"/>
@@ -16600,10 +16618,10 @@
         </w:r>
       </w:hyperlink>
     </w:p>
-    <w:bookmarkEnd w:id="192"/>
     <w:bookmarkEnd w:id="193"/>
     <w:bookmarkEnd w:id="194"/>
-    <w:bookmarkStart w:id="204" w:name="Xc69cd6e803bfffecb1c25fddf9e46ca13c121b8"/>
+    <w:bookmarkEnd w:id="195"/>
+    <w:bookmarkStart w:id="205" w:name="Xc69cd6e803bfffecb1c25fddf9e46ca13c121b8"/>
     <w:p>
       <w:pPr>
         <w:pStyle w:val="Heading1"/>
@@ -16620,7 +16638,7 @@
         <w:t xml:space="preserve">Equation numbers refer to the main text.</w:t>
       </w:r>
     </w:p>
-    <w:bookmarkStart w:id="195" w:name="X7c01e28133c15b07462cebe3d8d9b77a0f71cb5"/>
+    <w:bookmarkStart w:id="196" w:name="X7c01e28133c15b07462cebe3d8d9b77a0f71cb5"/>
     <w:p>
       <w:pPr>
         <w:pStyle w:val="Heading2"/>
@@ -17649,8 +17667,8 @@
         <w:t xml:space="preserve">: the posterior mean is a martingale. The beliefs about the other items do not change.</w:t>
       </w:r>
     </w:p>
-    <w:bookmarkEnd w:id="195"/>
-    <w:bookmarkStart w:id="196" w:name="X70a69b293eabf2c8862f70853439d6abd613caf"/>
+    <w:bookmarkEnd w:id="196"/>
+    <w:bookmarkStart w:id="197" w:name="X70a69b293eabf2c8862f70853439d6abd613caf"/>
     <w:p>
       <w:pPr>
         <w:pStyle w:val="Heading2"/>
@@ -20705,8 +20723,8 @@
         <w:t xml:space="preserve">for every non-leading item, and the second case reduces to the value of sampling the leader against the runner-up. These are the quantities that drive attention to the top two items in Callaway et al. (2021).</w:t>
       </w:r>
     </w:p>
-    <w:bookmarkEnd w:id="196"/>
-    <w:bookmarkStart w:id="197" w:name="X9501e0a3d5a35c17890f48526cba02c2faffb55"/>
+    <w:bookmarkEnd w:id="197"/>
+    <w:bookmarkStart w:id="198" w:name="X9501e0a3d5a35c17890f48526cba02c2faffb55"/>
     <w:p>
       <w:pPr>
         <w:pStyle w:val="Heading2"/>
@@ -21333,8 +21351,8 @@
         <w:t xml:space="preserve">in every case we examined.</w:t>
       </w:r>
     </w:p>
-    <w:bookmarkEnd w:id="197"/>
-    <w:bookmarkStart w:id="198" w:name="d.-selecting-k-items-is-rejecting-n---k"/>
+    <w:bookmarkEnd w:id="198"/>
+    <w:bookmarkStart w:id="199" w:name="d.-selecting-k-items-is-rejecting-n---k"/>
     <w:p>
       <w:pPr>
         <w:pStyle w:val="Heading2"/>
@@ -22987,8 +23005,8 @@
         <w:t xml:space="preserve">policy allocates to the two highest (Fig 2).</w:t>
       </w:r>
     </w:p>
-    <w:bookmarkEnd w:id="198"/>
-    <w:bookmarkStart w:id="199" w:name="e.-the-response-policies-as-algorithms"/>
+    <w:bookmarkEnd w:id="199"/>
+    <w:bookmarkStart w:id="200" w:name="e.-the-response-policies-as-algorithms"/>
     <w:p>
       <w:pPr>
         <w:pStyle w:val="Heading2"/>
@@ -24905,8 +24923,8 @@
         <w:t xml:space="preserve">In every policy, consecutive samples of the same item are concatenated into one fixation, each sample lasts 100 ms, and the response times are the sample counts at which items are committed.</w:t>
       </w:r>
     </w:p>
-    <w:bookmarkEnd w:id="199"/>
-    <w:bookmarkStart w:id="200" w:name="f.-parameter-search"/>
+    <w:bookmarkEnd w:id="200"/>
+    <w:bookmarkStart w:id="201" w:name="f.-parameter-search"/>
     <w:p>
       <w:pPr>
         <w:pStyle w:val="Heading2"/>
@@ -25166,8 +25184,8 @@
         <w:t xml:space="preserve">. Stage 2 drew 150 configurations log-uniformly from the box spanned by the ten best stage-1 configurations, widened by a factor of 1.3 on each side. Every configuration was simulated once on each even-numbered trial with usable response time and gaze data (9857 trials), with the true values set by Eq 11, and scored by Eq 12. The best configuration of stage 2 was then simulated five times on every usable trial for the figures, which show the odd-numbered trials. Because the simulation is stochastic, the loss surface is noisy; the ten best stage-2 configurations of each policy lie within a factor of about 1.5 of each other on every parameter, and their predictions are visually indistinguishable in the figures.</w:t>
       </w:r>
     </w:p>
-    <w:bookmarkEnd w:id="200"/>
-    <w:bookmarkStart w:id="201" w:name="Xec33ea8531106d04c1643ecdd3f28b2b8f9cfd6"/>
+    <w:bookmarkEnd w:id="201"/>
+    <w:bookmarkStart w:id="202" w:name="Xec33ea8531106d04c1643ecdd3f28b2b8f9cfd6"/>
     <w:p>
       <w:pPr>
         <w:pStyle w:val="Heading2"/>
@@ -26987,8 +27005,8 @@
         </w:tc>
       </w:tr>
     </w:tbl>
-    <w:bookmarkEnd w:id="201"/>
-    <w:bookmarkStart w:id="202" w:name="h.-parameter-and-policy-recovery"/>
+    <w:bookmarkEnd w:id="202"/>
+    <w:bookmarkStart w:id="203" w:name="h.-parameter-and-policy-recovery"/>
     <w:p>
       <w:pPr>
         <w:pStyle w:val="Heading2"/>
@@ -27653,8 +27671,8 @@
         </w:tc>
       </w:tr>
     </w:tbl>
-    <w:bookmarkEnd w:id="202"/>
-    <w:bookmarkStart w:id="203" w:name="i.-eye-movement-descriptives"/>
+    <w:bookmarkEnd w:id="203"/>
+    <w:bookmarkStart w:id="204" w:name="i.-eye-movement-descriptives"/>
     <w:p>
       <w:pPr>
         <w:pStyle w:val="Heading2"/>
@@ -27909,7 +27927,7 @@
               <w:pStyle w:val="Compact"/>
             </w:pPr>
             <w:r>
-              <w:t xml:space="preserve">—</w:t>
+              <w:t xml:space="preserve">n/a</w:t>
             </w:r>
           </w:p>
         </w:tc>
@@ -27955,7 +27973,7 @@
               <w:pStyle w:val="Compact"/>
             </w:pPr>
             <w:r>
-              <w:t xml:space="preserve">—</w:t>
+              <w:t xml:space="preserve">n/a</w:t>
             </w:r>
           </w:p>
         </w:tc>
@@ -28673,8 +28691,8 @@
         </w:tc>
       </w:tr>
     </w:tbl>
-    <w:bookmarkEnd w:id="203"/>
     <w:bookmarkEnd w:id="204"/>
+    <w:bookmarkEnd w:id="205"/>
     <w:sectPr>
       <w:footnotePr>
         <w:numRestart w:val="eachSect"/>

</xml_diff>